<commit_message>
feat: improve analysis process and system prompts
- Introduce new subagent system prompts for movement intelligence, causality, thesis, and narrative (02a-02d)
- Refine existing system prompts for risk analyzer and report generator
- Update local server and handler flows to support improved processing
- Enhance financial math calculations and add new models to analyzer
- Update generated test outputs and accounting data
- Remove unused CreditIQ_Template_EEFF.docx fixture
</commit_message>
<xml_diff>
--- a/agents_outputs_test/report_generator_report.docx
+++ b/agents_outputs_test/report_generator_report.docx
@@ -513,7 +513,7 @@
                 <w:sz w:val="18"/>
                 <w:szCs w:val="18"/>
               </w:rPr>
-              <w:t>03/06/2026</w:t>
+              <w:t>06/06/2026</w:t>
             </w:r>
           </w:p>
         </w:tc>
@@ -1188,7 +1188,7 @@
           <w:bCs/>
           <w:color w:val="2D3E4A"/>
         </w:rPr>
-        <w:t>El entorno macroeconómico colombiano durante el primer semestre de 2025 se caracteriza por sentimiento positivo en mercados de renta variable, con apreciación de la moneda local y volatilidad elevada. Si bien datos específicos de tasas de interés e inflación no están disponibles en el período analizado, el desempeño de activos locales refleja un contexto de apetito por riesgo moderado en equities, con sectores de energía e infraestructura mostrando tendencias positivas (Ecopetrol +33%, Grupo Argos +7.7%) y sector financiero también con señales constructivas. La liquidez de mercado se mantiene estable, permitiendo rotaciones de cartera sin fricción significativa.</w:t>
+        <w:t>El entorno macroeconómico colombiano durante el primer semestre de 2025 se caracteriza por una apreciación de la moneda y volatilidad de mercado elevada, con sentimiento positivo en renta variable pero apetito de riesgo moderado. El sector energético mostró desempeño positivo (Ecopetrol +23.9% en 90 días), mientras que infraestructura enfrentó presión negativa. En este contexto de incertidumbre macroeconómica y volatilidad sectorial, el fondo ejecutó una rotación defensiva concentrada, liquidando exposición bancaria diversificada hacia una apuesta idiosincrática de alto riesgo en Grupo Cibest, reflejando una estrategia de selección de valores sobre diversificación en un mercado volátil.</w:t>
       </w:r>
     </w:p>
     <w:p>
@@ -1897,7 +1897,7 @@
                 <w:sz w:val="18"/>
                 <w:szCs w:val="18"/>
               </w:rPr>
-              <w:t>262.1</w:t>
+              <w:t>0.262</w:t>
             </w:r>
           </w:p>
         </w:tc>
@@ -1928,7 +1928,7 @@
                 <w:sz w:val="18"/>
                 <w:szCs w:val="18"/>
               </w:rPr>
-              <w:t>137.2</w:t>
+              <w:t>0.137</w:t>
             </w:r>
           </w:p>
         </w:tc>
@@ -1959,7 +1959,7 @@
                 <w:sz w:val="18"/>
                 <w:szCs w:val="18"/>
               </w:rPr>
-              <w:t>124.9</w:t>
+              <w:t>0.125</w:t>
             </w:r>
           </w:p>
         </w:tc>
@@ -2051,7 +2051,7 @@
                 <w:sz w:val="18"/>
                 <w:szCs w:val="18"/>
               </w:rPr>
-              <w:t>Instrumentos financieros de inversión</w:t>
+              <w:t>Activos financieros a valor razonable - Instrumentos de inversión</w:t>
             </w:r>
           </w:p>
         </w:tc>
@@ -2082,7 +2082,7 @@
                 <w:sz w:val="18"/>
                 <w:szCs w:val="18"/>
               </w:rPr>
-              <w:t>39,521.3</w:t>
+              <w:t>39.5</w:t>
             </w:r>
           </w:p>
         </w:tc>
@@ -2113,7 +2113,7 @@
                 <w:sz w:val="18"/>
                 <w:szCs w:val="18"/>
               </w:rPr>
-              <w:t>52,559.6</w:t>
+              <w:t>52.6</w:t>
             </w:r>
           </w:p>
         </w:tc>
@@ -2144,7 +2144,7 @@
                 <w:sz w:val="18"/>
                 <w:szCs w:val="18"/>
               </w:rPr>
-              <w:t>-13,038.4</w:t>
+              <w:t>-13.0</w:t>
             </w:r>
           </w:p>
         </w:tc>
@@ -2267,7 +2267,7 @@
                 <w:sz w:val="18"/>
                 <w:szCs w:val="18"/>
               </w:rPr>
-              <w:t>30.0</w:t>
+              <w:t>0.030</w:t>
             </w:r>
           </w:p>
         </w:tc>
@@ -2298,7 +2298,7 @@
                 <w:sz w:val="18"/>
                 <w:szCs w:val="18"/>
               </w:rPr>
-              <w:t>7.4</w:t>
+              <w:t>0.00740</w:t>
             </w:r>
           </w:p>
         </w:tc>
@@ -2329,7 +2329,7 @@
                 <w:sz w:val="18"/>
                 <w:szCs w:val="18"/>
               </w:rPr>
-              <w:t>22.6</w:t>
+              <w:t>0.023</w:t>
             </w:r>
           </w:p>
         </w:tc>
@@ -2452,7 +2452,7 @@
                 <w:sz w:val="18"/>
                 <w:szCs w:val="18"/>
               </w:rPr>
-              <w:t>39,813.4</w:t>
+              <w:t>39.8</w:t>
             </w:r>
           </w:p>
         </w:tc>
@@ -2483,7 +2483,7 @@
                 <w:sz w:val="18"/>
                 <w:szCs w:val="18"/>
               </w:rPr>
-              <w:t>52,704.2</w:t>
+              <w:t>52.7</w:t>
             </w:r>
           </w:p>
         </w:tc>
@@ -2514,7 +2514,7 @@
                 <w:sz w:val="18"/>
                 <w:szCs w:val="18"/>
               </w:rPr>
-              <w:t>-12,890.8</w:t>
+              <w:t>-12.9</w:t>
             </w:r>
           </w:p>
         </w:tc>
@@ -2637,7 +2637,7 @@
                 <w:sz w:val="18"/>
                 <w:szCs w:val="18"/>
               </w:rPr>
-              <w:t>19.4</w:t>
+              <w:t>0.019</w:t>
             </w:r>
           </w:p>
         </w:tc>
@@ -2668,7 +2668,7 @@
                 <w:sz w:val="18"/>
                 <w:szCs w:val="18"/>
               </w:rPr>
-              <w:t>9.8</w:t>
+              <w:t>0.00984</w:t>
             </w:r>
           </w:p>
         </w:tc>
@@ -2699,7 +2699,7 @@
                 <w:sz w:val="18"/>
                 <w:szCs w:val="18"/>
               </w:rPr>
-              <w:t>9.6</w:t>
+              <w:t>0.00961</w:t>
             </w:r>
           </w:p>
         </w:tc>
@@ -2822,7 +2822,7 @@
                 <w:sz w:val="18"/>
                 <w:szCs w:val="18"/>
               </w:rPr>
-              <w:t>19.4</w:t>
+              <w:t>0.019</w:t>
             </w:r>
           </w:p>
         </w:tc>
@@ -2853,7 +2853,7 @@
                 <w:sz w:val="18"/>
                 <w:szCs w:val="18"/>
               </w:rPr>
-              <w:t>9.8</w:t>
+              <w:t>0.00984</w:t>
             </w:r>
           </w:p>
         </w:tc>
@@ -2884,7 +2884,7 @@
                 <w:sz w:val="18"/>
                 <w:szCs w:val="18"/>
               </w:rPr>
-              <w:t>9.6</w:t>
+              <w:t>0.00961</w:t>
             </w:r>
           </w:p>
         </w:tc>
@@ -2976,7 +2976,7 @@
                 <w:sz w:val="18"/>
                 <w:szCs w:val="18"/>
               </w:rPr>
-              <w:t>Derechos o suscripciones de inversionistas</w:t>
+              <w:t>Patrimonio neto de inversionistas - Derechos de suscripción</w:t>
             </w:r>
           </w:p>
         </w:tc>
@@ -3007,7 +3007,7 @@
                 <w:sz w:val="18"/>
                 <w:szCs w:val="18"/>
               </w:rPr>
-              <w:t>28,034.5</w:t>
+              <w:t>28.0</w:t>
             </w:r>
           </w:p>
         </w:tc>
@@ -3038,7 +3038,7 @@
                 <w:sz w:val="18"/>
                 <w:szCs w:val="18"/>
               </w:rPr>
-              <w:t>47,306.4</w:t>
+              <w:t>47.3</w:t>
             </w:r>
           </w:p>
         </w:tc>
@@ -3069,7 +3069,7 @@
                 <w:sz w:val="18"/>
                 <w:szCs w:val="18"/>
               </w:rPr>
-              <w:t>-19,271.9</w:t>
+              <w:t>-19.3</w:t>
             </w:r>
           </w:p>
         </w:tc>
@@ -3192,7 +3192,7 @@
                 <w:sz w:val="18"/>
                 <w:szCs w:val="18"/>
               </w:rPr>
-              <w:t>11,759.4</w:t>
+              <w:t>11.8</w:t>
             </w:r>
           </w:p>
         </w:tc>
@@ -3223,7 +3223,7 @@
                 <w:sz w:val="18"/>
                 <w:szCs w:val="18"/>
               </w:rPr>
-              <w:t>5,387.9</w:t>
+              <w:t>5.4</w:t>
             </w:r>
           </w:p>
         </w:tc>
@@ -3254,7 +3254,7 @@
                 <w:sz w:val="18"/>
                 <w:szCs w:val="18"/>
               </w:rPr>
-              <w:t>6,371.5</w:t>
+              <w:t>6.4</w:t>
             </w:r>
           </w:p>
         </w:tc>
@@ -3346,7 +3346,7 @@
                 <w:sz w:val="18"/>
                 <w:szCs w:val="18"/>
               </w:rPr>
-              <w:t>Total Activo Neto de Inversionistas</w:t>
+              <w:t>Total Patrimonio Neto de Inversionistas</w:t>
             </w:r>
           </w:p>
         </w:tc>
@@ -3377,7 +3377,7 @@
                 <w:sz w:val="18"/>
                 <w:szCs w:val="18"/>
               </w:rPr>
-              <w:t>39,793.9</w:t>
+              <w:t>39.8</w:t>
             </w:r>
           </w:p>
         </w:tc>
@@ -3408,7 +3408,7 @@
                 <w:sz w:val="18"/>
                 <w:szCs w:val="18"/>
               </w:rPr>
-              <w:t>52,694.4</w:t>
+              <w:t>52.7</w:t>
             </w:r>
           </w:p>
         </w:tc>
@@ -3439,7 +3439,7 @@
                 <w:sz w:val="18"/>
                 <w:szCs w:val="18"/>
               </w:rPr>
-              <w:t>-12,900.4</w:t>
+              <w:t>-12.9</w:t>
             </w:r>
           </w:p>
         </w:tc>
@@ -3563,7 +3563,7 @@
           <w:bCs/>
           <w:color w:val="2D3E4A"/>
         </w:rPr>
-        <w:t xml:space="preserve">El activo total del fondo contrajo 24.5% durante el período, pasando de COP 52,704 MM a COP 39,813 MM, reflejando redenciones masivas de inversionistas que superaron nuevas suscripciones. Los instrumentos financieros de inversión representan el 99.3% del activo (COP 39,521 MM), concentrados enteramente en renta variable local con jerarquía de valor razonable Nivel 1. El efectivo y equivalentes (COP 262 MM) representa apenas 0.7% del activo, indicando despliegue eficiente de capital sin acumulación de caja. La cartera mantiene exposición pura a equities sin diversificación hacia activos de renta fija o instrumentos de cobertura. Cuentas por cobrar son inmateriales (COP 30 MM). </w:t>
+        <w:t xml:space="preserve">Los activos totales del fondo contrajeron 24.5% entre 2024-12 y 2025-06, cayendo de COP 52.7 MM a COP 39.8 MM. Esta contracción refleja principalmente la liquidación de instrumentos de inversión (-24.8%, -13.0 COP MM), que representan 99.3% del portafolio. El efectivo y equivalentes aumentaron marginalmente a COP 0.3 MM (0.7% del activo), concentrado en depósitos bancarios con exposición crítica de contraparte: 73.4% en Banco de Occidente versus límite regulatorio de 25%, generando riesgo de concentración sistémica. La rotación de cartera de clientes es eficiente (0.5 días), pero la estructura de activos es altamente vulnerable a correcciones de mercado dado que el 100% corresponde a instrumentos de patrimonio sin diversificación de clases de activo. </w:t>
       </w:r>
     </w:p>
     <w:p>
@@ -3622,7 +3622,7 @@
           <w:bCs/>
           <w:color w:val="2D3E4A"/>
         </w:rPr>
-        <w:t xml:space="preserve">La estructura de pasivos del fondo es mínima y prácticamente irrelevante desde perspectiva de riesgo financiero. Los pasivos totales alcanzan COP 19.4 MM (0.05% del activo), compuestos por cuentas por pagar operativas (COP 11.9 MM a acreedores) y comisión de administración devengada a BTG Pactual (COP 7.5 MM). No existe endeudamiento financiero ni instrumentos de deuda. Los derechos de inversionistas (COP 28,034 MM) representan una obligación de reembolso futuro ante redenciones, pero no constituyen pasivo en sentido tradicional. El fondo opera con estructura de capital prácticamente libre de apalancamiento, con razón corriente de 2,047 veces, asegurando capacidad de pago inmediata incluso ante presiones de redención concentradas. </w:t>
+        <w:t xml:space="preserve">El pasivo total del fondo es prácticamente nulo (COP 0.0 MM en 2025-06 versus COP 0.0 MM en 2024-12), reflejando una estructura de capital sin apalancamiento financiero. El endeudamiento global es de 0.0005, indicando que el fondo opera sin deuda y depende exclusivamente de capital de inversionistas. No existen cuentas por pagar materiales ni compromisos de corto plazo fuera de comisiones de administración (COP 0.3 MM acumuladas). Esta estructura de pasivos fortalece la solvencia técnica del fondo, pero la ausencia de ingresos operacionales recurrentes y la dependencia de valorización no realizada (72.2% del resultado) generan vulnerabilidad operacional en escenarios de corrección de mercado. </w:t>
       </w:r>
     </w:p>
     <w:p>
@@ -3977,7 +3977,7 @@
                 <w:sz w:val="18"/>
                 <w:szCs w:val="18"/>
               </w:rPr>
-              <w:t>12,098.8</w:t>
+              <w:t>12.1</w:t>
             </w:r>
           </w:p>
         </w:tc>
@@ -4008,7 +4008,7 @@
                 <w:sz w:val="18"/>
                 <w:szCs w:val="18"/>
               </w:rPr>
-              <w:t>2,842.2</w:t>
+              <w:t>2.8</w:t>
             </w:r>
           </w:p>
         </w:tc>
@@ -4039,7 +4039,7 @@
                 <w:sz w:val="18"/>
                 <w:szCs w:val="18"/>
               </w:rPr>
-              <w:t>9,256.6</w:t>
+              <w:t>9.3</w:t>
             </w:r>
           </w:p>
         </w:tc>
@@ -4131,7 +4131,7 @@
                 <w:sz w:val="18"/>
                 <w:szCs w:val="18"/>
               </w:rPr>
-              <w:t>-50.8</w:t>
+              <w:t>-0.051</w:t>
             </w:r>
           </w:p>
         </w:tc>
@@ -4162,7 +4162,7 @@
                 <w:sz w:val="18"/>
                 <w:szCs w:val="18"/>
               </w:rPr>
-              <w:t>-22.6</w:t>
+              <w:t>-0.023</w:t>
             </w:r>
           </w:p>
         </w:tc>
@@ -4193,7 +4193,7 @@
                 <w:sz w:val="18"/>
                 <w:szCs w:val="18"/>
               </w:rPr>
-              <w:t>-28.2</w:t>
+              <w:t>-0.028</w:t>
             </w:r>
           </w:p>
         </w:tc>
@@ -4224,7 +4224,7 @@
                 <w:sz w:val="18"/>
                 <w:szCs w:val="18"/>
               </w:rPr>
-              <w:t>+124.6%</w:t>
+              <w:t>-124.6%</w:t>
             </w:r>
           </w:p>
         </w:tc>
@@ -4254,7 +4254,7 @@
                 <w:sz w:val="18"/>
                 <w:szCs w:val="18"/>
               </w:rPr>
-              <w:t>Utilidad operacional</w:t>
+              <w:t>Gastos administrativos</w:t>
             </w:r>
           </w:p>
         </w:tc>
@@ -4285,7 +4285,7 @@
                 <w:sz w:val="18"/>
                 <w:szCs w:val="18"/>
               </w:rPr>
-              <w:t>12,048.0</w:t>
+              <w:t>-0.289</w:t>
             </w:r>
           </w:p>
         </w:tc>
@@ -4316,7 +4316,7 @@
                 <w:sz w:val="18"/>
                 <w:szCs w:val="18"/>
               </w:rPr>
-              <w:t>2,819.6</w:t>
+              <w:t>-0.116</w:t>
             </w:r>
           </w:p>
         </w:tc>
@@ -4347,7 +4347,7 @@
                 <w:sz w:val="18"/>
                 <w:szCs w:val="18"/>
               </w:rPr>
-              <w:t>9,228.4</w:t>
+              <w:t>-0.172</w:t>
             </w:r>
           </w:p>
         </w:tc>
@@ -4378,7 +4378,7 @@
                 <w:sz w:val="18"/>
                 <w:szCs w:val="18"/>
               </w:rPr>
-              <w:t>+327.3%</w:t>
+              <w:t>-147.9%</w:t>
             </w:r>
           </w:p>
         </w:tc>
@@ -4408,7 +4408,7 @@
                 <w:sz w:val="18"/>
                 <w:szCs w:val="18"/>
               </w:rPr>
-              <w:t>Gastos administrativos</w:t>
+              <w:t>Utilidad del período</w:t>
             </w:r>
           </w:p>
         </w:tc>
@@ -4439,7 +4439,7 @@
                 <w:sz w:val="18"/>
                 <w:szCs w:val="18"/>
               </w:rPr>
-              <w:t>-288.6</w:t>
+              <w:t>11.8</w:t>
             </w:r>
           </w:p>
         </w:tc>
@@ -4470,7 +4470,7 @@
                 <w:sz w:val="18"/>
                 <w:szCs w:val="18"/>
               </w:rPr>
-              <w:t>-116.4</w:t>
+              <w:t>2.7</w:t>
             </w:r>
           </w:p>
         </w:tc>
@@ -4501,7 +4501,7 @@
                 <w:sz w:val="18"/>
                 <w:szCs w:val="18"/>
               </w:rPr>
-              <w:t>-172.2</w:t>
+              <w:t>9.1</w:t>
             </w:r>
           </w:p>
         </w:tc>
@@ -4515,160 +4515,6 @@
               <w:right w:val="single" w:sz="4" w:space="0" w:color="C5CDD9"/>
             </w:tcBorders>
             <w:shd w:val="clear" w:color="auto" w:fill="F2F3F4"/>
-            <w:tcMar>
-              <w:top w:w="70" w:type="dxa"/>
-              <w:left w:w="100" w:type="dxa"/>
-              <w:bottom w:w="70" w:type="dxa"/>
-              <w:right w:w="100" w:type="dxa"/>
-            </w:tcMar>
-          </w:tcPr>
-          <w:p>
-            <w:pPr>
-              <w:jc w:val="right"/>
-            </w:pPr>
-            <w:r>
-              <w:rPr>
-                <w:color w:val="2D3E4A"/>
-                <w:sz w:val="18"/>
-                <w:szCs w:val="18"/>
-              </w:rPr>
-              <w:t>+147.9%</w:t>
-            </w:r>
-          </w:p>
-        </w:tc>
-      </w:tr>
-      <w:tr>
-        <w:tc>
-          <w:tcPr>
-            <w:tcW w:w="3200" w:type="dxa"/>
-            <w:tcBorders>
-              <w:top w:val="single" w:sz="4" w:space="0" w:color="C5CDD9"/>
-              <w:left w:val="single" w:sz="4" w:space="0" w:color="C5CDD9"/>
-              <w:bottom w:val="single" w:sz="4" w:space="0" w:color="C5CDD9"/>
-              <w:right w:val="single" w:sz="4" w:space="0" w:color="C5CDD9"/>
-            </w:tcBorders>
-            <w:shd w:val="clear" w:color="auto" w:fill="FFFFFF"/>
-            <w:tcMar>
-              <w:top w:w="70" w:type="dxa"/>
-              <w:left w:w="100" w:type="dxa"/>
-              <w:bottom w:w="70" w:type="dxa"/>
-              <w:right w:w="100" w:type="dxa"/>
-            </w:tcMar>
-          </w:tcPr>
-          <w:p>
-            <w:r>
-              <w:rPr>
-                <w:color w:val="2D3E4A"/>
-                <w:sz w:val="18"/>
-                <w:szCs w:val="18"/>
-              </w:rPr>
-              <w:t>Utilidad del período</w:t>
-            </w:r>
-          </w:p>
-        </w:tc>
-        <w:tc>
-          <w:tcPr>
-            <w:tcW w:w="1600" w:type="dxa"/>
-            <w:tcBorders>
-              <w:top w:val="single" w:sz="4" w:space="0" w:color="C5CDD9"/>
-              <w:left w:val="single" w:sz="4" w:space="0" w:color="C5CDD9"/>
-              <w:bottom w:val="single" w:sz="4" w:space="0" w:color="C5CDD9"/>
-              <w:right w:val="single" w:sz="4" w:space="0" w:color="C5CDD9"/>
-            </w:tcBorders>
-            <w:shd w:val="clear" w:color="auto" w:fill="FFFFFF"/>
-            <w:tcMar>
-              <w:top w:w="70" w:type="dxa"/>
-              <w:left w:w="100" w:type="dxa"/>
-              <w:bottom w:w="70" w:type="dxa"/>
-              <w:right w:w="100" w:type="dxa"/>
-            </w:tcMar>
-          </w:tcPr>
-          <w:p>
-            <w:pPr>
-              <w:jc w:val="right"/>
-            </w:pPr>
-            <w:r>
-              <w:rPr>
-                <w:color w:val="2D3E4A"/>
-                <w:sz w:val="18"/>
-                <w:szCs w:val="18"/>
-              </w:rPr>
-              <w:t>11,759.4</w:t>
-            </w:r>
-          </w:p>
-        </w:tc>
-        <w:tc>
-          <w:tcPr>
-            <w:tcW w:w="1600" w:type="dxa"/>
-            <w:tcBorders>
-              <w:top w:val="single" w:sz="4" w:space="0" w:color="C5CDD9"/>
-              <w:left w:val="single" w:sz="4" w:space="0" w:color="C5CDD9"/>
-              <w:bottom w:val="single" w:sz="4" w:space="0" w:color="C5CDD9"/>
-              <w:right w:val="single" w:sz="4" w:space="0" w:color="C5CDD9"/>
-            </w:tcBorders>
-            <w:shd w:val="clear" w:color="auto" w:fill="FFFFFF"/>
-            <w:tcMar>
-              <w:top w:w="70" w:type="dxa"/>
-              <w:left w:w="100" w:type="dxa"/>
-              <w:bottom w:w="70" w:type="dxa"/>
-              <w:right w:w="100" w:type="dxa"/>
-            </w:tcMar>
-          </w:tcPr>
-          <w:p>
-            <w:pPr>
-              <w:jc w:val="right"/>
-            </w:pPr>
-            <w:r>
-              <w:rPr>
-                <w:color w:val="2D3E4A"/>
-                <w:sz w:val="18"/>
-                <w:szCs w:val="18"/>
-              </w:rPr>
-              <w:t>2,703.2</w:t>
-            </w:r>
-          </w:p>
-        </w:tc>
-        <w:tc>
-          <w:tcPr>
-            <w:tcW w:w="1600" w:type="dxa"/>
-            <w:tcBorders>
-              <w:top w:val="single" w:sz="4" w:space="0" w:color="C5CDD9"/>
-              <w:left w:val="single" w:sz="4" w:space="0" w:color="C5CDD9"/>
-              <w:bottom w:val="single" w:sz="4" w:space="0" w:color="C5CDD9"/>
-              <w:right w:val="single" w:sz="4" w:space="0" w:color="C5CDD9"/>
-            </w:tcBorders>
-            <w:shd w:val="clear" w:color="auto" w:fill="FFFFFF"/>
-            <w:tcMar>
-              <w:top w:w="70" w:type="dxa"/>
-              <w:left w:w="100" w:type="dxa"/>
-              <w:bottom w:w="70" w:type="dxa"/>
-              <w:right w:w="100" w:type="dxa"/>
-            </w:tcMar>
-          </w:tcPr>
-          <w:p>
-            <w:pPr>
-              <w:jc w:val="right"/>
-            </w:pPr>
-            <w:r>
-              <w:rPr>
-                <w:color w:val="2D3E4A"/>
-                <w:sz w:val="18"/>
-                <w:szCs w:val="18"/>
-              </w:rPr>
-              <w:t>9,056.2</w:t>
-            </w:r>
-          </w:p>
-        </w:tc>
-        <w:tc>
-          <w:tcPr>
-            <w:tcW w:w="1638" w:type="dxa"/>
-            <w:tcBorders>
-              <w:top w:val="single" w:sz="4" w:space="0" w:color="C5CDD9"/>
-              <w:left w:val="single" w:sz="4" w:space="0" w:color="C5CDD9"/>
-              <w:bottom w:val="single" w:sz="4" w:space="0" w:color="C5CDD9"/>
-              <w:right w:val="single" w:sz="4" w:space="0" w:color="C5CDD9"/>
-            </w:tcBorders>
-            <w:shd w:val="clear" w:color="auto" w:fill="FFFFFF"/>
             <w:tcMar>
               <w:top w:w="70" w:type="dxa"/>
               <w:left w:w="100" w:type="dxa"/>
@@ -4749,7 +4595,7 @@
           <w:bCs/>
           <w:color w:val="2D3E4A"/>
         </w:rPr>
-        <w:t xml:space="preserve">La rentabilidad del fondo en el período fue excepcional, con ROE de 29.6% y ROA de 29.5%, sustentados en utilidad neta de COP 11,759 MM sobre NAV de cierre de COP 39,794 MM. Sin embargo, la calidad de estas ganancias es crítica: 72.2% de los ingresos operacionales (COP 8,740 MM de COP 12,099 MM) provienen de valorización a valor razonable de inversiones, mientras que ingresos recurrentes (dividendos COP 3,215 MM, rendimientos bancarios COP 27 MM) representan apenas 27.8%. El margen neto de 97.2% y margen EBITDA de 97.2% reflejan estructura de costos extremadamente baja (gastos administrativos COP 289 MM, gastos operacionales COP 51 MM). Esta rentabilidad es altamente sensible a volatilidad de mercado: una corrección de 10-15% en valuaciones de equities locales eliminaría la mayoría de utilidades del período. Los resultados no son sostenibles ni proyectables bajo metodología de ingresos recurrentes. </w:t>
+        <w:t xml:space="preserve">La utilidad del período aumentó 118.2% entre 2024-12 y 2025-06, creciendo de COP 5.4 MM a COP 11.8 MM, impulsada principalmente por ingresos de valorización a valor razonable que representan 72.2% del ingreso total (COP 8.7 MM de COP 12.1 MM). El margen operacional alcanzó 97.23%, el margen neto 97.1981%, y el ROE fue 29.55%, indicadores que reflejan eficiencia operacional pero ocultan una estructura de rentabilidad frágil. Los ingresos por dividendos (COP 3.2 MM) y venta de inversiones (COP 0.1 MM) proporcionan apenas 27.8% del resultado, insuficiente para sostener operaciones en escenarios de volatilidad. La calidad de utilidades es MEDIA (score 56.9/100) debido a la extrema dependencia de ganancias no realizadas, haciendo que los resultados no sean proyectables con metodología de ingresos recurrentes. </w:t>
       </w:r>
     </w:p>
     <w:p>
@@ -4902,7 +4748,7 @@
                 <w:b/>
                 <w:bCs/>
               </w:rPr>
-              <w:t>39,521.3</w:t>
+              <w:t>39.5</w:t>
             </w:r>
           </w:p>
         </w:tc>
@@ -4990,7 +4836,7 @@
                 <w:b/>
                 <w:bCs/>
               </w:rPr>
-              <w:t>+96.8%</w:t>
+              <w:t>0.0%</w:t>
             </w:r>
           </w:p>
         </w:tc>
@@ -5034,7 +4880,7 @@
                 <w:b/>
                 <w:bCs/>
               </w:rPr>
-              <w:t>+3.2%</w:t>
+              <w:t>+100.0%</w:t>
             </w:r>
           </w:p>
         </w:tc>
@@ -5366,7 +5212,7 @@
                 <w:sz w:val="18"/>
                 <w:szCs w:val="18"/>
               </w:rPr>
-              <w:t>327.74</w:t>
+              <w:t>0.33</w:t>
             </w:r>
           </w:p>
         </w:tc>
@@ -5397,7 +5243,7 @@
                 <w:sz w:val="18"/>
                 <w:szCs w:val="18"/>
               </w:rPr>
-              <w:t>15,617.9</w:t>
+              <w:t>15.6</w:t>
             </w:r>
           </w:p>
         </w:tc>
@@ -5428,7 +5274,7 @@
                 <w:sz w:val="18"/>
                 <w:szCs w:val="18"/>
               </w:rPr>
-              <w:t>N/D</w:t>
+              <w:t>0.0</w:t>
             </w:r>
           </w:p>
         </w:tc>
@@ -5551,7 +5397,7 @@
                 <w:sz w:val="18"/>
                 <w:szCs w:val="18"/>
               </w:rPr>
-              <w:t>256.12</w:t>
+              <w:t>0.26</w:t>
             </w:r>
           </w:p>
         </w:tc>
@@ -5582,7 +5428,7 @@
                 <w:sz w:val="18"/>
                 <w:szCs w:val="18"/>
               </w:rPr>
-              <w:t>5,066.1</w:t>
+              <w:t>5.1</w:t>
             </w:r>
           </w:p>
         </w:tc>
@@ -5613,7 +5459,7 @@
                 <w:sz w:val="18"/>
                 <w:szCs w:val="18"/>
               </w:rPr>
-              <w:t>3,160.4</w:t>
+              <w:t>3.2</w:t>
             </w:r>
           </w:p>
         </w:tc>
@@ -5736,7 +5582,7 @@
                 <w:sz w:val="18"/>
                 <w:szCs w:val="18"/>
               </w:rPr>
-              <w:t>2,015.70</w:t>
+              <w:t>2.02</w:t>
             </w:r>
           </w:p>
         </w:tc>
@@ -5767,7 +5613,7 @@
                 <w:sz w:val="18"/>
                 <w:szCs w:val="18"/>
               </w:rPr>
-              <w:t>3,668.6</w:t>
+              <w:t>3.7</w:t>
             </w:r>
           </w:p>
         </w:tc>
@@ -5798,7 +5644,7 @@
                 <w:sz w:val="18"/>
                 <w:szCs w:val="18"/>
               </w:rPr>
-              <w:t>4,433.2</w:t>
+              <w:t>4.4</w:t>
             </w:r>
           </w:p>
         </w:tc>
@@ -5921,7 +5767,7 @@
                 <w:sz w:val="18"/>
                 <w:szCs w:val="18"/>
               </w:rPr>
-              <w:t>1,142.01</w:t>
+              <w:t>1.14</w:t>
             </w:r>
           </w:p>
         </w:tc>
@@ -5952,7 +5798,7 @@
                 <w:sz w:val="18"/>
                 <w:szCs w:val="18"/>
               </w:rPr>
-              <w:t>3,448.9</w:t>
+              <w:t>3.4</w:t>
             </w:r>
           </w:p>
         </w:tc>
@@ -5983,7 +5829,7 @@
                 <w:sz w:val="18"/>
                 <w:szCs w:val="18"/>
               </w:rPr>
-              <w:t>2,831.2</w:t>
+              <w:t>2.8</w:t>
             </w:r>
           </w:p>
         </w:tc>
@@ -6106,7 +5952,7 @@
                 <w:sz w:val="18"/>
                 <w:szCs w:val="18"/>
               </w:rPr>
-              <w:t>90.14</w:t>
+              <w:t>0.09</w:t>
             </w:r>
           </w:p>
         </w:tc>
@@ -6137,7 +5983,7 @@
                 <w:sz w:val="18"/>
                 <w:szCs w:val="18"/>
               </w:rPr>
-              <w:t>3,389.4</w:t>
+              <w:t>3.4</w:t>
             </w:r>
           </w:p>
         </w:tc>
@@ -6168,7 +6014,7 @@
                 <w:sz w:val="18"/>
                 <w:szCs w:val="18"/>
               </w:rPr>
-              <w:t>5,720.9</w:t>
+              <w:t>5.7</w:t>
             </w:r>
           </w:p>
         </w:tc>
@@ -6291,7 +6137,7 @@
                 <w:sz w:val="18"/>
                 <w:szCs w:val="18"/>
               </w:rPr>
-              <w:t>125.52</w:t>
+              <w:t>0.13</w:t>
             </w:r>
           </w:p>
         </w:tc>
@@ -6322,7 +6168,7 @@
                 <w:sz w:val="18"/>
                 <w:szCs w:val="18"/>
               </w:rPr>
-              <w:t>2,771.5</w:t>
+              <w:t>2.8</w:t>
             </w:r>
           </w:p>
         </w:tc>
@@ -6353,7 +6199,7 @@
                 <w:sz w:val="18"/>
                 <w:szCs w:val="18"/>
               </w:rPr>
-              <w:t>4,339.7</w:t>
+              <w:t>4.3</w:t>
             </w:r>
           </w:p>
         </w:tc>
@@ -6476,7 +6322,7 @@
                 <w:sz w:val="18"/>
                 <w:szCs w:val="18"/>
               </w:rPr>
-              <w:t>234.67</w:t>
+              <w:t>0.23</w:t>
             </w:r>
           </w:p>
         </w:tc>
@@ -6507,7 +6353,7 @@
                 <w:sz w:val="18"/>
                 <w:szCs w:val="18"/>
               </w:rPr>
-              <w:t>2,417.1</w:t>
+              <w:t>2.4</w:t>
             </w:r>
           </w:p>
         </w:tc>
@@ -6538,7 +6384,7 @@
                 <w:sz w:val="18"/>
                 <w:szCs w:val="18"/>
               </w:rPr>
-              <w:t>9,172.6</w:t>
+              <w:t>9.2</w:t>
             </w:r>
           </w:p>
         </w:tc>
@@ -6661,7 +6507,7 @@
                 <w:sz w:val="18"/>
                 <w:szCs w:val="18"/>
               </w:rPr>
-              <w:t>4,960.68</w:t>
+              <w:t>4.96</w:t>
             </w:r>
           </w:p>
         </w:tc>
@@ -6692,7 +6538,7 @@
                 <w:sz w:val="18"/>
                 <w:szCs w:val="18"/>
               </w:rPr>
-              <w:t>1,557.7</w:t>
+              <w:t>1.6</w:t>
             </w:r>
           </w:p>
         </w:tc>
@@ -6723,7 +6569,7 @@
                 <w:sz w:val="18"/>
                 <w:szCs w:val="18"/>
               </w:rPr>
-              <w:t>2,647.4</w:t>
+              <w:t>2.6</w:t>
             </w:r>
           </w:p>
         </w:tc>
@@ -6784,7 +6630,7 @@
                 <w:sz w:val="18"/>
                 <w:szCs w:val="18"/>
               </w:rPr>
-              <w:t>BTG Pactual S.A.</w:t>
+              <w:t>BTG Pactual S.A. Comisionista de Bolsa</w:t>
             </w:r>
           </w:p>
         </w:tc>
@@ -6846,7 +6692,7 @@
                 <w:sz w:val="18"/>
                 <w:szCs w:val="18"/>
               </w:rPr>
-              <w:t>46.96</w:t>
+              <w:t>0.05</w:t>
             </w:r>
           </w:p>
         </w:tc>
@@ -6877,7 +6723,7 @@
                 <w:sz w:val="18"/>
                 <w:szCs w:val="18"/>
               </w:rPr>
-              <w:t>970.1</w:t>
+              <w:t>0.970</w:t>
             </w:r>
           </w:p>
         </w:tc>
@@ -6908,7 +6754,7 @@
                 <w:sz w:val="18"/>
                 <w:szCs w:val="18"/>
               </w:rPr>
-              <w:t>272.4</w:t>
+              <w:t>0.272</w:t>
             </w:r>
           </w:p>
         </w:tc>
@@ -7031,7 +6877,7 @@
                 <w:sz w:val="18"/>
                 <w:szCs w:val="18"/>
               </w:rPr>
-              <w:t>224.52</w:t>
+              <w:t>0.22</w:t>
             </w:r>
           </w:p>
         </w:tc>
@@ -7062,7 +6908,7 @@
                 <w:sz w:val="18"/>
                 <w:szCs w:val="18"/>
               </w:rPr>
-              <w:t>614.1</w:t>
+              <w:t>0.614</w:t>
             </w:r>
           </w:p>
         </w:tc>
@@ -7093,7 +6939,7 @@
                 <w:sz w:val="18"/>
                 <w:szCs w:val="18"/>
               </w:rPr>
-              <w:t>N/D</w:t>
+              <w:t>0.0</w:t>
             </w:r>
           </w:p>
         </w:tc>
@@ -7278,7 +7124,7 @@
                 <w:sz w:val="18"/>
                 <w:szCs w:val="18"/>
               </w:rPr>
-              <w:t>19,981.9</w:t>
+              <w:t>20.0</w:t>
             </w:r>
           </w:p>
         </w:tc>
@@ -7567,7 +7413,7 @@
                 <w:sz w:val="18"/>
                 <w:szCs w:val="18"/>
               </w:rPr>
-              <w:t>Acciones Locales - Nivel 1 Jerarquía Valor Razonable</w:t>
+              <w:t>Instrumentos de patrimonio</w:t>
             </w:r>
           </w:p>
         </w:tc>
@@ -7598,7 +7444,7 @@
                 <w:sz w:val="18"/>
                 <w:szCs w:val="18"/>
               </w:rPr>
-              <w:t>38,551.2</w:t>
+              <w:t>N/D</w:t>
             </w:r>
           </w:p>
         </w:tc>
@@ -7660,7 +7506,7 @@
                 <w:sz w:val="18"/>
                 <w:szCs w:val="18"/>
               </w:rPr>
-              <w:t>52,287.2</w:t>
+              <w:t>N/D</w:t>
             </w:r>
           </w:p>
         </w:tc>
@@ -7721,7 +7567,7 @@
                 <w:sz w:val="18"/>
                 <w:szCs w:val="18"/>
               </w:rPr>
-              <w:t>Fondos de Inversión - Nivel 2 Jerarquía Valor Razonable</w:t>
+              <w:t>Instrumentos de deuda</w:t>
             </w:r>
           </w:p>
         </w:tc>
@@ -7783,7 +7629,7 @@
                 <w:sz w:val="18"/>
                 <w:szCs w:val="18"/>
               </w:rPr>
-              <w:t>970.1</w:t>
+              <w:t>N/D</w:t>
             </w:r>
           </w:p>
         </w:tc>
@@ -7845,7 +7691,315 @@
                 <w:sz w:val="18"/>
                 <w:szCs w:val="18"/>
               </w:rPr>
-              <w:t>272.4</w:t>
+              <w:t>N/D</w:t>
+            </w:r>
+          </w:p>
+        </w:tc>
+      </w:tr>
+      <w:tr>
+        <w:tc>
+          <w:tcPr>
+            <w:tcW w:w="2400" w:type="dxa"/>
+            <w:tcBorders>
+              <w:top w:val="single" w:sz="4" w:space="0" w:color="C5CDD9"/>
+              <w:left w:val="single" w:sz="4" w:space="0" w:color="C5CDD9"/>
+              <w:bottom w:val="single" w:sz="4" w:space="0" w:color="C5CDD9"/>
+              <w:right w:val="single" w:sz="4" w:space="0" w:color="C5CDD9"/>
+            </w:tcBorders>
+            <w:shd w:val="clear" w:color="auto" w:fill="FFFFFF"/>
+            <w:tcMar>
+              <w:top w:w="70" w:type="dxa"/>
+              <w:left w:w="100" w:type="dxa"/>
+              <w:bottom w:w="70" w:type="dxa"/>
+              <w:right w:w="100" w:type="dxa"/>
+            </w:tcMar>
+          </w:tcPr>
+          <w:p>
+            <w:r>
+              <w:rPr>
+                <w:color w:val="2D3E4A"/>
+                <w:sz w:val="18"/>
+                <w:szCs w:val="18"/>
+              </w:rPr>
+              <w:t>Derivados</w:t>
+            </w:r>
+          </w:p>
+        </w:tc>
+        <w:tc>
+          <w:tcPr>
+            <w:tcW w:w="1760" w:type="dxa"/>
+            <w:tcBorders>
+              <w:top w:val="single" w:sz="4" w:space="0" w:color="C5CDD9"/>
+              <w:left w:val="single" w:sz="4" w:space="0" w:color="C5CDD9"/>
+              <w:bottom w:val="single" w:sz="4" w:space="0" w:color="C5CDD9"/>
+              <w:right w:val="single" w:sz="4" w:space="0" w:color="C5CDD9"/>
+            </w:tcBorders>
+            <w:shd w:val="clear" w:color="auto" w:fill="FFFFFF"/>
+            <w:tcMar>
+              <w:top w:w="70" w:type="dxa"/>
+              <w:left w:w="100" w:type="dxa"/>
+              <w:bottom w:w="70" w:type="dxa"/>
+              <w:right w:w="100" w:type="dxa"/>
+            </w:tcMar>
+          </w:tcPr>
+          <w:p>
+            <w:pPr>
+              <w:jc w:val="right"/>
+            </w:pPr>
+            <w:r>
+              <w:rPr>
+                <w:color w:val="2D3E4A"/>
+                <w:sz w:val="18"/>
+                <w:szCs w:val="18"/>
+              </w:rPr>
+              <w:t>N/D</w:t>
+            </w:r>
+          </w:p>
+        </w:tc>
+        <w:tc>
+          <w:tcPr>
+            <w:tcW w:w="1760" w:type="dxa"/>
+            <w:tcBorders>
+              <w:top w:val="single" w:sz="4" w:space="0" w:color="C5CDD9"/>
+              <w:left w:val="single" w:sz="4" w:space="0" w:color="C5CDD9"/>
+              <w:bottom w:val="single" w:sz="4" w:space="0" w:color="C5CDD9"/>
+              <w:right w:val="single" w:sz="4" w:space="0" w:color="C5CDD9"/>
+            </w:tcBorders>
+            <w:shd w:val="clear" w:color="auto" w:fill="FFFFFF"/>
+            <w:tcMar>
+              <w:top w:w="70" w:type="dxa"/>
+              <w:left w:w="100" w:type="dxa"/>
+              <w:bottom w:w="70" w:type="dxa"/>
+              <w:right w:w="100" w:type="dxa"/>
+            </w:tcMar>
+          </w:tcPr>
+          <w:p>
+            <w:pPr>
+              <w:jc w:val="right"/>
+            </w:pPr>
+            <w:r>
+              <w:rPr>
+                <w:color w:val="2D3E4A"/>
+                <w:sz w:val="18"/>
+                <w:szCs w:val="18"/>
+              </w:rPr>
+              <w:t>N/D</w:t>
+            </w:r>
+          </w:p>
+        </w:tc>
+        <w:tc>
+          <w:tcPr>
+            <w:tcW w:w="1760" w:type="dxa"/>
+            <w:tcBorders>
+              <w:top w:val="single" w:sz="4" w:space="0" w:color="C5CDD9"/>
+              <w:left w:val="single" w:sz="4" w:space="0" w:color="C5CDD9"/>
+              <w:bottom w:val="single" w:sz="4" w:space="0" w:color="C5CDD9"/>
+              <w:right w:val="single" w:sz="4" w:space="0" w:color="C5CDD9"/>
+            </w:tcBorders>
+            <w:shd w:val="clear" w:color="auto" w:fill="FFFFFF"/>
+            <w:tcMar>
+              <w:top w:w="70" w:type="dxa"/>
+              <w:left w:w="100" w:type="dxa"/>
+              <w:bottom w:w="70" w:type="dxa"/>
+              <w:right w:w="100" w:type="dxa"/>
+            </w:tcMar>
+          </w:tcPr>
+          <w:p>
+            <w:pPr>
+              <w:jc w:val="right"/>
+            </w:pPr>
+            <w:r>
+              <w:rPr>
+                <w:color w:val="2D3E4A"/>
+                <w:sz w:val="18"/>
+                <w:szCs w:val="18"/>
+              </w:rPr>
+              <w:t>N/D</w:t>
+            </w:r>
+          </w:p>
+        </w:tc>
+        <w:tc>
+          <w:tcPr>
+            <w:tcW w:w="1958" w:type="dxa"/>
+            <w:tcBorders>
+              <w:top w:val="single" w:sz="4" w:space="0" w:color="C5CDD9"/>
+              <w:left w:val="single" w:sz="4" w:space="0" w:color="C5CDD9"/>
+              <w:bottom w:val="single" w:sz="4" w:space="0" w:color="C5CDD9"/>
+              <w:right w:val="single" w:sz="4" w:space="0" w:color="C5CDD9"/>
+            </w:tcBorders>
+            <w:shd w:val="clear" w:color="auto" w:fill="FFFFFF"/>
+            <w:tcMar>
+              <w:top w:w="70" w:type="dxa"/>
+              <w:left w:w="100" w:type="dxa"/>
+              <w:bottom w:w="70" w:type="dxa"/>
+              <w:right w:w="100" w:type="dxa"/>
+            </w:tcMar>
+          </w:tcPr>
+          <w:p>
+            <w:pPr>
+              <w:jc w:val="right"/>
+            </w:pPr>
+            <w:r>
+              <w:rPr>
+                <w:color w:val="2D3E4A"/>
+                <w:sz w:val="18"/>
+                <w:szCs w:val="18"/>
+              </w:rPr>
+              <w:t>N/D</w:t>
+            </w:r>
+          </w:p>
+        </w:tc>
+      </w:tr>
+      <w:tr>
+        <w:tc>
+          <w:tcPr>
+            <w:tcW w:w="2400" w:type="dxa"/>
+            <w:tcBorders>
+              <w:top w:val="single" w:sz="4" w:space="0" w:color="C5CDD9"/>
+              <w:left w:val="single" w:sz="4" w:space="0" w:color="C5CDD9"/>
+              <w:bottom w:val="single" w:sz="4" w:space="0" w:color="C5CDD9"/>
+              <w:right w:val="single" w:sz="4" w:space="0" w:color="C5CDD9"/>
+            </w:tcBorders>
+            <w:shd w:val="clear" w:color="auto" w:fill="F2F3F4"/>
+            <w:tcMar>
+              <w:top w:w="70" w:type="dxa"/>
+              <w:left w:w="100" w:type="dxa"/>
+              <w:bottom w:w="70" w:type="dxa"/>
+              <w:right w:w="100" w:type="dxa"/>
+            </w:tcMar>
+          </w:tcPr>
+          <w:p>
+            <w:r>
+              <w:rPr>
+                <w:color w:val="2D3E4A"/>
+                <w:sz w:val="18"/>
+                <w:szCs w:val="18"/>
+              </w:rPr>
+              <w:t>Total</w:t>
+            </w:r>
+          </w:p>
+        </w:tc>
+        <w:tc>
+          <w:tcPr>
+            <w:tcW w:w="1760" w:type="dxa"/>
+            <w:tcBorders>
+              <w:top w:val="single" w:sz="4" w:space="0" w:color="C5CDD9"/>
+              <w:left w:val="single" w:sz="4" w:space="0" w:color="C5CDD9"/>
+              <w:bottom w:val="single" w:sz="4" w:space="0" w:color="C5CDD9"/>
+              <w:right w:val="single" w:sz="4" w:space="0" w:color="C5CDD9"/>
+            </w:tcBorders>
+            <w:shd w:val="clear" w:color="auto" w:fill="F2F3F4"/>
+            <w:tcMar>
+              <w:top w:w="70" w:type="dxa"/>
+              <w:left w:w="100" w:type="dxa"/>
+              <w:bottom w:w="70" w:type="dxa"/>
+              <w:right w:w="100" w:type="dxa"/>
+            </w:tcMar>
+          </w:tcPr>
+          <w:p>
+            <w:pPr>
+              <w:jc w:val="right"/>
+            </w:pPr>
+            <w:r>
+              <w:rPr>
+                <w:color w:val="2D3E4A"/>
+                <w:sz w:val="18"/>
+                <w:szCs w:val="18"/>
+              </w:rPr>
+              <w:t>N/D</w:t>
+            </w:r>
+          </w:p>
+        </w:tc>
+        <w:tc>
+          <w:tcPr>
+            <w:tcW w:w="1760" w:type="dxa"/>
+            <w:tcBorders>
+              <w:top w:val="single" w:sz="4" w:space="0" w:color="C5CDD9"/>
+              <w:left w:val="single" w:sz="4" w:space="0" w:color="C5CDD9"/>
+              <w:bottom w:val="single" w:sz="4" w:space="0" w:color="C5CDD9"/>
+              <w:right w:val="single" w:sz="4" w:space="0" w:color="C5CDD9"/>
+            </w:tcBorders>
+            <w:shd w:val="clear" w:color="auto" w:fill="F2F3F4"/>
+            <w:tcMar>
+              <w:top w:w="70" w:type="dxa"/>
+              <w:left w:w="100" w:type="dxa"/>
+              <w:bottom w:w="70" w:type="dxa"/>
+              <w:right w:w="100" w:type="dxa"/>
+            </w:tcMar>
+          </w:tcPr>
+          <w:p>
+            <w:pPr>
+              <w:jc w:val="right"/>
+            </w:pPr>
+            <w:r>
+              <w:rPr>
+                <w:color w:val="2D3E4A"/>
+                <w:sz w:val="18"/>
+                <w:szCs w:val="18"/>
+              </w:rPr>
+              <w:t>N/D</w:t>
+            </w:r>
+          </w:p>
+        </w:tc>
+        <w:tc>
+          <w:tcPr>
+            <w:tcW w:w="1760" w:type="dxa"/>
+            <w:tcBorders>
+              <w:top w:val="single" w:sz="4" w:space="0" w:color="C5CDD9"/>
+              <w:left w:val="single" w:sz="4" w:space="0" w:color="C5CDD9"/>
+              <w:bottom w:val="single" w:sz="4" w:space="0" w:color="C5CDD9"/>
+              <w:right w:val="single" w:sz="4" w:space="0" w:color="C5CDD9"/>
+            </w:tcBorders>
+            <w:shd w:val="clear" w:color="auto" w:fill="F2F3F4"/>
+            <w:tcMar>
+              <w:top w:w="70" w:type="dxa"/>
+              <w:left w:w="100" w:type="dxa"/>
+              <w:bottom w:w="70" w:type="dxa"/>
+              <w:right w:w="100" w:type="dxa"/>
+            </w:tcMar>
+          </w:tcPr>
+          <w:p>
+            <w:pPr>
+              <w:jc w:val="right"/>
+            </w:pPr>
+            <w:r>
+              <w:rPr>
+                <w:color w:val="2D3E4A"/>
+                <w:sz w:val="18"/>
+                <w:szCs w:val="18"/>
+              </w:rPr>
+              <w:t>N/D</w:t>
+            </w:r>
+          </w:p>
+        </w:tc>
+        <w:tc>
+          <w:tcPr>
+            <w:tcW w:w="1958" w:type="dxa"/>
+            <w:tcBorders>
+              <w:top w:val="single" w:sz="4" w:space="0" w:color="C5CDD9"/>
+              <w:left w:val="single" w:sz="4" w:space="0" w:color="C5CDD9"/>
+              <w:bottom w:val="single" w:sz="4" w:space="0" w:color="C5CDD9"/>
+              <w:right w:val="single" w:sz="4" w:space="0" w:color="C5CDD9"/>
+            </w:tcBorders>
+            <w:shd w:val="clear" w:color="auto" w:fill="F2F3F4"/>
+            <w:tcMar>
+              <w:top w:w="70" w:type="dxa"/>
+              <w:left w:w="100" w:type="dxa"/>
+              <w:bottom w:w="70" w:type="dxa"/>
+              <w:right w:w="100" w:type="dxa"/>
+            </w:tcMar>
+          </w:tcPr>
+          <w:p>
+            <w:pPr>
+              <w:jc w:val="right"/>
+            </w:pPr>
+            <w:r>
+              <w:rPr>
+                <w:color w:val="2D3E4A"/>
+                <w:sz w:val="18"/>
+                <w:szCs w:val="18"/>
+              </w:rPr>
+              <w:t>N/D</w:t>
             </w:r>
           </w:p>
         </w:tc>
@@ -7893,7 +8047,7 @@
           <w:bCs/>
           <w:color w:val="2D3E4A"/>
         </w:rPr>
-        <w:t xml:space="preserve">El portafolio experimentó rotación estratégica deliberada desde exposición bancaria sistémica hacia renta variable de consumo y conglomerados. Se liquidó posición en Bancolombia (COP 19,982 MM, -100%) y se ingresaron nuevas posiciones en Grupo Cibest (COP 15,618 MM, 10.3% del portafolio) y Almacenes Éxito (COP 614 MM, 0.4%). Posiciones existentes fueron redesplegadas con entrada neta de COP 28,035 MM de nuevos inversionistas. A pesar de la rotación, concentración crítica persiste: la posición TOP1 (Acciones Locales - Nivel 1 Jerarquía Valor Razonable) representa 96.8% del AUM, con top 3 posiciones concentrando 72.9%. El índice HHI de 1.0 indica 1.0 posiciones efectivas, equivalente a cartera de un solo emisor. La composición sectorial refleja exposición a energía (Ecopetrol 3,669 MM), infraestructura (ISA 5,066 MM, GEB 3,449 MM), seguros (Grupo Sura 3,389 MM) y consumo minorista (Almacenes Éxito 614 MM), pero sin diversificación geográfica ni de clase de activo. </w:t>
+        <w:t xml:space="preserve">El portafolio ejecutó una rotación estratégica defensiva con reposicionamiento concentrado entre 2024-12 y 2025-06. Se liquidó la exposición bancaria diversificada (Inversión - Bancolombia: -100%, -20.0 COP MM) y se redujo significativamente Cementos Argos (-73.7%, -6.8 COP MM), mientras se ingresó una nueva posición dominante en Grupo Cibest (+15.6 COP MM, 39.6% del portafolio actual). La composición actual es 100% instrumentos de patrimonio, con concentración extrema: la posición top-1 (Grupo Cibest) supera el límite regulatorio de 10% en 29.2 puntos porcentuales, y las top-3 posiciones (Grupo Cibest 39.2%, ISA 12.7%, Ecopetrol 9.2%) representan 61.1% del portafolio. Esta estructura refleja una apuesta idiosincrática de alto riesgo en lugar de diversificación sectorial, financiada por realización de ganancias y flujo operacional positivo pero vulnerable a reversión de mercado. </w:t>
       </w:r>
     </w:p>
     <w:p>
@@ -8218,7 +8372,7 @@
                 <w:sz w:val="18"/>
                 <w:szCs w:val="18"/>
               </w:rPr>
-              <w:t>Clase P - Activos Netos</w:t>
+              <w:t>Patrimonio - Clase P</w:t>
             </w:r>
           </w:p>
         </w:tc>
@@ -8342,7 +8496,7 @@
                 <w:sz w:val="18"/>
                 <w:szCs w:val="18"/>
               </w:rPr>
-              <w:t>19,582.2</w:t>
+              <w:t>19.6</w:t>
             </w:r>
           </w:p>
         </w:tc>
@@ -8403,7 +8557,7 @@
                 <w:sz w:val="18"/>
                 <w:szCs w:val="18"/>
               </w:rPr>
-              <w:t>Clase A - Activos Netos</w:t>
+              <w:t>Patrimonio - Clase A</w:t>
             </w:r>
           </w:p>
         </w:tc>
@@ -8527,7 +8681,7 @@
                 <w:sz w:val="18"/>
                 <w:szCs w:val="18"/>
               </w:rPr>
-              <w:t>7,829.1</w:t>
+              <w:t>7.8</w:t>
             </w:r>
           </w:p>
         </w:tc>
@@ -8588,7 +8742,7 @@
                 <w:sz w:val="18"/>
                 <w:szCs w:val="18"/>
               </w:rPr>
-              <w:t>Clase I4 - Activos Netos</w:t>
+              <w:t>Patrimonio - Clase I4</w:t>
             </w:r>
           </w:p>
         </w:tc>
@@ -8712,7 +8866,7 @@
                 <w:sz w:val="18"/>
                 <w:szCs w:val="18"/>
               </w:rPr>
-              <w:t>5,513.1</w:t>
+              <w:t>5.5</w:t>
             </w:r>
           </w:p>
         </w:tc>
@@ -8773,7 +8927,7 @@
                 <w:sz w:val="18"/>
                 <w:szCs w:val="18"/>
               </w:rPr>
-              <w:t>Clase B2 - Activos Netos</w:t>
+              <w:t>Patrimonio - Clase B2</w:t>
             </w:r>
           </w:p>
         </w:tc>
@@ -8897,7 +9051,7 @@
                 <w:sz w:val="18"/>
                 <w:szCs w:val="18"/>
               </w:rPr>
-              <w:t>5,103.4</w:t>
+              <w:t>5.1</w:t>
             </w:r>
           </w:p>
         </w:tc>
@@ -8958,7 +9112,7 @@
                 <w:sz w:val="18"/>
                 <w:szCs w:val="18"/>
               </w:rPr>
-              <w:t>Clase F3 - Activos Netos</w:t>
+              <w:t>Patrimonio - Clase F3</w:t>
             </w:r>
           </w:p>
         </w:tc>
@@ -9082,7 +9236,7 @@
                 <w:sz w:val="18"/>
                 <w:szCs w:val="18"/>
               </w:rPr>
-              <w:t>1,766.2</w:t>
+              <w:t>1.8</w:t>
             </w:r>
           </w:p>
         </w:tc>
@@ -9336,7 +9490,7 @@
                 <w:sz w:val="18"/>
                 <w:szCs w:val="18"/>
               </w:rPr>
-              <w:t>Saldo inicial (NAV apertura)</w:t>
+              <w:t>Utilidad del período</w:t>
             </w:r>
           </w:p>
         </w:tc>
@@ -9367,7 +9521,7 @@
                 <w:sz w:val="18"/>
                 <w:szCs w:val="18"/>
               </w:rPr>
-              <w:t>52,694.4</w:t>
+              <w:t>11.8</w:t>
             </w:r>
           </w:p>
         </w:tc>
@@ -9398,7 +9552,7 @@
                 <w:sz w:val="18"/>
                 <w:szCs w:val="18"/>
               </w:rPr>
-              <w:t>N/D</w:t>
+              <w:t>2.7</w:t>
             </w:r>
           </w:p>
         </w:tc>
@@ -9429,7 +9583,7 @@
                 <w:sz w:val="18"/>
                 <w:szCs w:val="18"/>
               </w:rPr>
-              <w:t>N/D</w:t>
+              <w:t>9.1</w:t>
             </w:r>
           </w:p>
         </w:tc>
@@ -9459,7 +9613,7 @@
                 <w:sz w:val="18"/>
                 <w:szCs w:val="18"/>
               </w:rPr>
-              <w:t>Suscripciones / redenciones netas</w:t>
+              <w:t>Ajuste: Utilidad por valoración de inversiones</w:t>
             </w:r>
           </w:p>
         </w:tc>
@@ -9490,7 +9644,7 @@
                 <w:sz w:val="18"/>
                 <w:szCs w:val="18"/>
               </w:rPr>
-              <w:t>28,034.5</w:t>
+              <w:t>-8.7</w:t>
             </w:r>
           </w:p>
         </w:tc>
@@ -9521,7 +9675,7 @@
                 <w:sz w:val="18"/>
                 <w:szCs w:val="18"/>
               </w:rPr>
-              <w:t>N/D</w:t>
+              <w:t>-2.0</w:t>
             </w:r>
           </w:p>
         </w:tc>
@@ -9552,7 +9706,7 @@
                 <w:sz w:val="18"/>
                 <w:szCs w:val="18"/>
               </w:rPr>
-              <w:t>N/D</w:t>
+              <w:t>-6.7</w:t>
             </w:r>
           </w:p>
         </w:tc>
@@ -9582,7 +9736,7 @@
                 <w:sz w:val="18"/>
                 <w:szCs w:val="18"/>
               </w:rPr>
-              <w:t>Resultado del período</w:t>
+              <w:t>Disminución de inversiones</w:t>
             </w:r>
           </w:p>
         </w:tc>
@@ -9613,7 +9767,7 @@
                 <w:sz w:val="18"/>
                 <w:szCs w:val="18"/>
               </w:rPr>
-              <w:t>11,759.4</w:t>
+              <w:t>21.8</w:t>
             </w:r>
           </w:p>
         </w:tc>
@@ -9644,7 +9798,7 @@
                 <w:sz w:val="18"/>
                 <w:szCs w:val="18"/>
               </w:rPr>
-              <w:t>N/D</w:t>
+              <w:t>-2.5</w:t>
             </w:r>
           </w:p>
         </w:tc>
@@ -9675,7 +9829,7 @@
                 <w:sz w:val="18"/>
                 <w:szCs w:val="18"/>
               </w:rPr>
-              <w:t>N/D</w:t>
+              <w:t>24.3</w:t>
             </w:r>
           </w:p>
         </w:tc>
@@ -9705,7 +9859,7 @@
                 <w:sz w:val="18"/>
                 <w:szCs w:val="18"/>
               </w:rPr>
-              <w:t>Saldo final (NAV cierre)</w:t>
+              <w:t>Aumento de cuentas por cobrar</w:t>
             </w:r>
           </w:p>
         </w:tc>
@@ -9736,7 +9890,7 @@
                 <w:sz w:val="18"/>
                 <w:szCs w:val="18"/>
               </w:rPr>
-              <w:t>39,793.9</w:t>
+              <w:t>-0.023</w:t>
             </w:r>
           </w:p>
         </w:tc>
@@ -9767,7 +9921,7 @@
                 <w:sz w:val="18"/>
                 <w:szCs w:val="18"/>
               </w:rPr>
-              <w:t>N/D</w:t>
+              <w:t>-0.157</w:t>
             </w:r>
           </w:p>
         </w:tc>
@@ -9798,7 +9952,745 @@
                 <w:sz w:val="18"/>
                 <w:szCs w:val="18"/>
               </w:rPr>
-              <w:t>N/D</w:t>
+              <w:t>0.135</w:t>
+            </w:r>
+          </w:p>
+        </w:tc>
+      </w:tr>
+      <w:tr>
+        <w:tc>
+          <w:tcPr>
+            <w:tcW w:w="3200" w:type="dxa"/>
+            <w:tcBorders>
+              <w:top w:val="single" w:sz="4" w:space="0" w:color="C5CDD9"/>
+              <w:left w:val="single" w:sz="4" w:space="0" w:color="C5CDD9"/>
+              <w:bottom w:val="single" w:sz="4" w:space="0" w:color="C5CDD9"/>
+              <w:right w:val="single" w:sz="4" w:space="0" w:color="C5CDD9"/>
+            </w:tcBorders>
+            <w:shd w:val="clear" w:color="auto" w:fill="F2F3F4"/>
+            <w:tcMar>
+              <w:top w:w="70" w:type="dxa"/>
+              <w:left w:w="100" w:type="dxa"/>
+              <w:bottom w:w="70" w:type="dxa"/>
+              <w:right w:w="100" w:type="dxa"/>
+            </w:tcMar>
+          </w:tcPr>
+          <w:p>
+            <w:r>
+              <w:rPr>
+                <w:color w:val="2D3E4A"/>
+                <w:sz w:val="18"/>
+                <w:szCs w:val="18"/>
+              </w:rPr>
+              <w:t>Aumento de cuentas por pagar</w:t>
+            </w:r>
+          </w:p>
+        </w:tc>
+        <w:tc>
+          <w:tcPr>
+            <w:tcW w:w="2000" w:type="dxa"/>
+            <w:tcBorders>
+              <w:top w:val="single" w:sz="4" w:space="0" w:color="C5CDD9"/>
+              <w:left w:val="single" w:sz="4" w:space="0" w:color="C5CDD9"/>
+              <w:bottom w:val="single" w:sz="4" w:space="0" w:color="C5CDD9"/>
+              <w:right w:val="single" w:sz="4" w:space="0" w:color="C5CDD9"/>
+            </w:tcBorders>
+            <w:shd w:val="clear" w:color="auto" w:fill="F2F3F4"/>
+            <w:tcMar>
+              <w:top w:w="70" w:type="dxa"/>
+              <w:left w:w="100" w:type="dxa"/>
+              <w:bottom w:w="70" w:type="dxa"/>
+              <w:right w:w="100" w:type="dxa"/>
+            </w:tcMar>
+          </w:tcPr>
+          <w:p>
+            <w:pPr>
+              <w:jc w:val="right"/>
+            </w:pPr>
+            <w:r>
+              <w:rPr>
+                <w:color w:val="2D3E4A"/>
+                <w:sz w:val="18"/>
+                <w:szCs w:val="18"/>
+              </w:rPr>
+              <w:t>0.00961</w:t>
+            </w:r>
+          </w:p>
+        </w:tc>
+        <w:tc>
+          <w:tcPr>
+            <w:tcW w:w="2000" w:type="dxa"/>
+            <w:tcBorders>
+              <w:top w:val="single" w:sz="4" w:space="0" w:color="C5CDD9"/>
+              <w:left w:val="single" w:sz="4" w:space="0" w:color="C5CDD9"/>
+              <w:bottom w:val="single" w:sz="4" w:space="0" w:color="C5CDD9"/>
+              <w:right w:val="single" w:sz="4" w:space="0" w:color="C5CDD9"/>
+            </w:tcBorders>
+            <w:shd w:val="clear" w:color="auto" w:fill="F2F3F4"/>
+            <w:tcMar>
+              <w:top w:w="70" w:type="dxa"/>
+              <w:left w:w="100" w:type="dxa"/>
+              <w:bottom w:w="70" w:type="dxa"/>
+              <w:right w:w="100" w:type="dxa"/>
+            </w:tcMar>
+          </w:tcPr>
+          <w:p>
+            <w:pPr>
+              <w:jc w:val="right"/>
+            </w:pPr>
+            <w:r>
+              <w:rPr>
+                <w:color w:val="2D3E4A"/>
+                <w:sz w:val="18"/>
+                <w:szCs w:val="18"/>
+              </w:rPr>
+              <w:t>0.000589</w:t>
+            </w:r>
+          </w:p>
+        </w:tc>
+        <w:tc>
+          <w:tcPr>
+            <w:tcW w:w="2438" w:type="dxa"/>
+            <w:tcBorders>
+              <w:top w:val="single" w:sz="4" w:space="0" w:color="C5CDD9"/>
+              <w:left w:val="single" w:sz="4" w:space="0" w:color="C5CDD9"/>
+              <w:bottom w:val="single" w:sz="4" w:space="0" w:color="C5CDD9"/>
+              <w:right w:val="single" w:sz="4" w:space="0" w:color="C5CDD9"/>
+            </w:tcBorders>
+            <w:shd w:val="clear" w:color="auto" w:fill="F2F3F4"/>
+            <w:tcMar>
+              <w:top w:w="70" w:type="dxa"/>
+              <w:left w:w="100" w:type="dxa"/>
+              <w:bottom w:w="70" w:type="dxa"/>
+              <w:right w:w="100" w:type="dxa"/>
+            </w:tcMar>
+          </w:tcPr>
+          <w:p>
+            <w:pPr>
+              <w:jc w:val="right"/>
+            </w:pPr>
+            <w:r>
+              <w:rPr>
+                <w:color w:val="2D3E4A"/>
+                <w:sz w:val="18"/>
+                <w:szCs w:val="18"/>
+              </w:rPr>
+              <w:t>0.00902</w:t>
+            </w:r>
+          </w:p>
+        </w:tc>
+      </w:tr>
+      <w:tr>
+        <w:tc>
+          <w:tcPr>
+            <w:tcW w:w="3200" w:type="dxa"/>
+            <w:tcBorders>
+              <w:top w:val="single" w:sz="4" w:space="0" w:color="C5CDD9"/>
+              <w:left w:val="single" w:sz="4" w:space="0" w:color="C5CDD9"/>
+              <w:bottom w:val="single" w:sz="4" w:space="0" w:color="C5CDD9"/>
+              <w:right w:val="single" w:sz="4" w:space="0" w:color="C5CDD9"/>
+            </w:tcBorders>
+            <w:shd w:val="clear" w:color="auto" w:fill="F2F3F4"/>
+            <w:tcMar>
+              <w:top w:w="70" w:type="dxa"/>
+              <w:left w:w="100" w:type="dxa"/>
+              <w:bottom w:w="70" w:type="dxa"/>
+              <w:right w:w="100" w:type="dxa"/>
+            </w:tcMar>
+          </w:tcPr>
+          <w:p>
+            <w:r>
+              <w:rPr>
+                <w:color w:val="2D3E4A"/>
+                <w:sz w:val="18"/>
+                <w:szCs w:val="18"/>
+              </w:rPr>
+              <w:t>Aportes de inversionistas</w:t>
+            </w:r>
+          </w:p>
+        </w:tc>
+        <w:tc>
+          <w:tcPr>
+            <w:tcW w:w="2000" w:type="dxa"/>
+            <w:tcBorders>
+              <w:top w:val="single" w:sz="4" w:space="0" w:color="C5CDD9"/>
+              <w:left w:val="single" w:sz="4" w:space="0" w:color="C5CDD9"/>
+              <w:bottom w:val="single" w:sz="4" w:space="0" w:color="C5CDD9"/>
+              <w:right w:val="single" w:sz="4" w:space="0" w:color="C5CDD9"/>
+            </w:tcBorders>
+            <w:shd w:val="clear" w:color="auto" w:fill="F2F3F4"/>
+            <w:tcMar>
+              <w:top w:w="70" w:type="dxa"/>
+              <w:left w:w="100" w:type="dxa"/>
+              <w:bottom w:w="70" w:type="dxa"/>
+              <w:right w:w="100" w:type="dxa"/>
+            </w:tcMar>
+          </w:tcPr>
+          <w:p>
+            <w:pPr>
+              <w:jc w:val="right"/>
+            </w:pPr>
+            <w:r>
+              <w:rPr>
+                <w:color w:val="2D3E4A"/>
+                <w:sz w:val="18"/>
+                <w:szCs w:val="18"/>
+              </w:rPr>
+              <w:t>18.9</w:t>
+            </w:r>
+          </w:p>
+        </w:tc>
+        <w:tc>
+          <w:tcPr>
+            <w:tcW w:w="2000" w:type="dxa"/>
+            <w:tcBorders>
+              <w:top w:val="single" w:sz="4" w:space="0" w:color="C5CDD9"/>
+              <w:left w:val="single" w:sz="4" w:space="0" w:color="C5CDD9"/>
+              <w:bottom w:val="single" w:sz="4" w:space="0" w:color="C5CDD9"/>
+              <w:right w:val="single" w:sz="4" w:space="0" w:color="C5CDD9"/>
+            </w:tcBorders>
+            <w:shd w:val="clear" w:color="auto" w:fill="F2F3F4"/>
+            <w:tcMar>
+              <w:top w:w="70" w:type="dxa"/>
+              <w:left w:w="100" w:type="dxa"/>
+              <w:bottom w:w="70" w:type="dxa"/>
+              <w:right w:w="100" w:type="dxa"/>
+            </w:tcMar>
+          </w:tcPr>
+          <w:p>
+            <w:pPr>
+              <w:jc w:val="right"/>
+            </w:pPr>
+            <w:r>
+              <w:rPr>
+                <w:color w:val="2D3E4A"/>
+                <w:sz w:val="18"/>
+                <w:szCs w:val="18"/>
+              </w:rPr>
+              <w:t>5.6</w:t>
+            </w:r>
+          </w:p>
+        </w:tc>
+        <w:tc>
+          <w:tcPr>
+            <w:tcW w:w="2438" w:type="dxa"/>
+            <w:tcBorders>
+              <w:top w:val="single" w:sz="4" w:space="0" w:color="C5CDD9"/>
+              <w:left w:val="single" w:sz="4" w:space="0" w:color="C5CDD9"/>
+              <w:bottom w:val="single" w:sz="4" w:space="0" w:color="C5CDD9"/>
+              <w:right w:val="single" w:sz="4" w:space="0" w:color="C5CDD9"/>
+            </w:tcBorders>
+            <w:shd w:val="clear" w:color="auto" w:fill="F2F3F4"/>
+            <w:tcMar>
+              <w:top w:w="70" w:type="dxa"/>
+              <w:left w:w="100" w:type="dxa"/>
+              <w:bottom w:w="70" w:type="dxa"/>
+              <w:right w:w="100" w:type="dxa"/>
+            </w:tcMar>
+          </w:tcPr>
+          <w:p>
+            <w:pPr>
+              <w:jc w:val="right"/>
+            </w:pPr>
+            <w:r>
+              <w:rPr>
+                <w:color w:val="2D3E4A"/>
+                <w:sz w:val="18"/>
+                <w:szCs w:val="18"/>
+              </w:rPr>
+              <w:t>13.3</w:t>
+            </w:r>
+          </w:p>
+        </w:tc>
+      </w:tr>
+      <w:tr>
+        <w:tc>
+          <w:tcPr>
+            <w:tcW w:w="3200" w:type="dxa"/>
+            <w:tcBorders>
+              <w:top w:val="single" w:sz="4" w:space="0" w:color="C5CDD9"/>
+              <w:left w:val="single" w:sz="4" w:space="0" w:color="C5CDD9"/>
+              <w:bottom w:val="single" w:sz="4" w:space="0" w:color="C5CDD9"/>
+              <w:right w:val="single" w:sz="4" w:space="0" w:color="C5CDD9"/>
+            </w:tcBorders>
+            <w:shd w:val="clear" w:color="auto" w:fill="F2F3F4"/>
+            <w:tcMar>
+              <w:top w:w="70" w:type="dxa"/>
+              <w:left w:w="100" w:type="dxa"/>
+              <w:bottom w:w="70" w:type="dxa"/>
+              <w:right w:w="100" w:type="dxa"/>
+            </w:tcMar>
+          </w:tcPr>
+          <w:p>
+            <w:r>
+              <w:rPr>
+                <w:color w:val="2D3E4A"/>
+                <w:sz w:val="18"/>
+                <w:szCs w:val="18"/>
+              </w:rPr>
+              <w:t>Retiros de inversionistas</w:t>
+            </w:r>
+          </w:p>
+        </w:tc>
+        <w:tc>
+          <w:tcPr>
+            <w:tcW w:w="2000" w:type="dxa"/>
+            <w:tcBorders>
+              <w:top w:val="single" w:sz="4" w:space="0" w:color="C5CDD9"/>
+              <w:left w:val="single" w:sz="4" w:space="0" w:color="C5CDD9"/>
+              <w:bottom w:val="single" w:sz="4" w:space="0" w:color="C5CDD9"/>
+              <w:right w:val="single" w:sz="4" w:space="0" w:color="C5CDD9"/>
+            </w:tcBorders>
+            <w:shd w:val="clear" w:color="auto" w:fill="F2F3F4"/>
+            <w:tcMar>
+              <w:top w:w="70" w:type="dxa"/>
+              <w:left w:w="100" w:type="dxa"/>
+              <w:bottom w:w="70" w:type="dxa"/>
+              <w:right w:w="100" w:type="dxa"/>
+            </w:tcMar>
+          </w:tcPr>
+          <w:p>
+            <w:pPr>
+              <w:jc w:val="right"/>
+            </w:pPr>
+            <w:r>
+              <w:rPr>
+                <w:color w:val="2D3E4A"/>
+                <w:sz w:val="18"/>
+                <w:szCs w:val="18"/>
+              </w:rPr>
+              <w:t>-43.6</w:t>
+            </w:r>
+          </w:p>
+        </w:tc>
+        <w:tc>
+          <w:tcPr>
+            <w:tcW w:w="2000" w:type="dxa"/>
+            <w:tcBorders>
+              <w:top w:val="single" w:sz="4" w:space="0" w:color="C5CDD9"/>
+              <w:left w:val="single" w:sz="4" w:space="0" w:color="C5CDD9"/>
+              <w:bottom w:val="single" w:sz="4" w:space="0" w:color="C5CDD9"/>
+              <w:right w:val="single" w:sz="4" w:space="0" w:color="C5CDD9"/>
+            </w:tcBorders>
+            <w:shd w:val="clear" w:color="auto" w:fill="F2F3F4"/>
+            <w:tcMar>
+              <w:top w:w="70" w:type="dxa"/>
+              <w:left w:w="100" w:type="dxa"/>
+              <w:bottom w:w="70" w:type="dxa"/>
+              <w:right w:w="100" w:type="dxa"/>
+            </w:tcMar>
+          </w:tcPr>
+          <w:p>
+            <w:pPr>
+              <w:jc w:val="right"/>
+            </w:pPr>
+            <w:r>
+              <w:rPr>
+                <w:color w:val="2D3E4A"/>
+                <w:sz w:val="18"/>
+                <w:szCs w:val="18"/>
+              </w:rPr>
+              <w:t>-3.6</w:t>
+            </w:r>
+          </w:p>
+        </w:tc>
+        <w:tc>
+          <w:tcPr>
+            <w:tcW w:w="2438" w:type="dxa"/>
+            <w:tcBorders>
+              <w:top w:val="single" w:sz="4" w:space="0" w:color="C5CDD9"/>
+              <w:left w:val="single" w:sz="4" w:space="0" w:color="C5CDD9"/>
+              <w:bottom w:val="single" w:sz="4" w:space="0" w:color="C5CDD9"/>
+              <w:right w:val="single" w:sz="4" w:space="0" w:color="C5CDD9"/>
+            </w:tcBorders>
+            <w:shd w:val="clear" w:color="auto" w:fill="F2F3F4"/>
+            <w:tcMar>
+              <w:top w:w="70" w:type="dxa"/>
+              <w:left w:w="100" w:type="dxa"/>
+              <w:bottom w:w="70" w:type="dxa"/>
+              <w:right w:w="100" w:type="dxa"/>
+            </w:tcMar>
+          </w:tcPr>
+          <w:p>
+            <w:pPr>
+              <w:jc w:val="right"/>
+            </w:pPr>
+            <w:r>
+              <w:rPr>
+                <w:color w:val="2D3E4A"/>
+                <w:sz w:val="18"/>
+                <w:szCs w:val="18"/>
+              </w:rPr>
+              <w:t>-40.0</w:t>
+            </w:r>
+          </w:p>
+        </w:tc>
+      </w:tr>
+      <w:tr>
+        <w:tc>
+          <w:tcPr>
+            <w:tcW w:w="3200" w:type="dxa"/>
+            <w:tcBorders>
+              <w:top w:val="single" w:sz="4" w:space="0" w:color="C5CDD9"/>
+              <w:left w:val="single" w:sz="4" w:space="0" w:color="C5CDD9"/>
+              <w:bottom w:val="single" w:sz="4" w:space="0" w:color="C5CDD9"/>
+              <w:right w:val="single" w:sz="4" w:space="0" w:color="C5CDD9"/>
+            </w:tcBorders>
+            <w:shd w:val="clear" w:color="auto" w:fill="F2F3F4"/>
+            <w:tcMar>
+              <w:top w:w="70" w:type="dxa"/>
+              <w:left w:w="100" w:type="dxa"/>
+              <w:bottom w:w="70" w:type="dxa"/>
+              <w:right w:w="100" w:type="dxa"/>
+            </w:tcMar>
+          </w:tcPr>
+          <w:p>
+            <w:r>
+              <w:rPr>
+                <w:color w:val="2D3E4A"/>
+                <w:sz w:val="18"/>
+                <w:szCs w:val="18"/>
+              </w:rPr>
+              <w:t>Aumento neto de efectivo</w:t>
+            </w:r>
+          </w:p>
+        </w:tc>
+        <w:tc>
+          <w:tcPr>
+            <w:tcW w:w="2000" w:type="dxa"/>
+            <w:tcBorders>
+              <w:top w:val="single" w:sz="4" w:space="0" w:color="C5CDD9"/>
+              <w:left w:val="single" w:sz="4" w:space="0" w:color="C5CDD9"/>
+              <w:bottom w:val="single" w:sz="4" w:space="0" w:color="C5CDD9"/>
+              <w:right w:val="single" w:sz="4" w:space="0" w:color="C5CDD9"/>
+            </w:tcBorders>
+            <w:shd w:val="clear" w:color="auto" w:fill="F2F3F4"/>
+            <w:tcMar>
+              <w:top w:w="70" w:type="dxa"/>
+              <w:left w:w="100" w:type="dxa"/>
+              <w:bottom w:w="70" w:type="dxa"/>
+              <w:right w:w="100" w:type="dxa"/>
+            </w:tcMar>
+          </w:tcPr>
+          <w:p>
+            <w:pPr>
+              <w:jc w:val="right"/>
+            </w:pPr>
+            <w:r>
+              <w:rPr>
+                <w:color w:val="2D3E4A"/>
+                <w:sz w:val="18"/>
+                <w:szCs w:val="18"/>
+              </w:rPr>
+              <w:t>0.125</w:t>
+            </w:r>
+          </w:p>
+        </w:tc>
+        <w:tc>
+          <w:tcPr>
+            <w:tcW w:w="2000" w:type="dxa"/>
+            <w:tcBorders>
+              <w:top w:val="single" w:sz="4" w:space="0" w:color="C5CDD9"/>
+              <w:left w:val="single" w:sz="4" w:space="0" w:color="C5CDD9"/>
+              <w:bottom w:val="single" w:sz="4" w:space="0" w:color="C5CDD9"/>
+              <w:right w:val="single" w:sz="4" w:space="0" w:color="C5CDD9"/>
+            </w:tcBorders>
+            <w:shd w:val="clear" w:color="auto" w:fill="F2F3F4"/>
+            <w:tcMar>
+              <w:top w:w="70" w:type="dxa"/>
+              <w:left w:w="100" w:type="dxa"/>
+              <w:bottom w:w="70" w:type="dxa"/>
+              <w:right w:w="100" w:type="dxa"/>
+            </w:tcMar>
+          </w:tcPr>
+          <w:p>
+            <w:pPr>
+              <w:jc w:val="right"/>
+            </w:pPr>
+            <w:r>
+              <w:rPr>
+                <w:color w:val="2D3E4A"/>
+                <w:sz w:val="18"/>
+                <w:szCs w:val="18"/>
+              </w:rPr>
+              <w:t>0.027</w:t>
+            </w:r>
+          </w:p>
+        </w:tc>
+        <w:tc>
+          <w:tcPr>
+            <w:tcW w:w="2438" w:type="dxa"/>
+            <w:tcBorders>
+              <w:top w:val="single" w:sz="4" w:space="0" w:color="C5CDD9"/>
+              <w:left w:val="single" w:sz="4" w:space="0" w:color="C5CDD9"/>
+              <w:bottom w:val="single" w:sz="4" w:space="0" w:color="C5CDD9"/>
+              <w:right w:val="single" w:sz="4" w:space="0" w:color="C5CDD9"/>
+            </w:tcBorders>
+            <w:shd w:val="clear" w:color="auto" w:fill="F2F3F4"/>
+            <w:tcMar>
+              <w:top w:w="70" w:type="dxa"/>
+              <w:left w:w="100" w:type="dxa"/>
+              <w:bottom w:w="70" w:type="dxa"/>
+              <w:right w:w="100" w:type="dxa"/>
+            </w:tcMar>
+          </w:tcPr>
+          <w:p>
+            <w:pPr>
+              <w:jc w:val="right"/>
+            </w:pPr>
+            <w:r>
+              <w:rPr>
+                <w:color w:val="2D3E4A"/>
+                <w:sz w:val="18"/>
+                <w:szCs w:val="18"/>
+              </w:rPr>
+              <w:t>0.098</w:t>
+            </w:r>
+          </w:p>
+        </w:tc>
+      </w:tr>
+      <w:tr>
+        <w:tc>
+          <w:tcPr>
+            <w:tcW w:w="3200" w:type="dxa"/>
+            <w:tcBorders>
+              <w:top w:val="single" w:sz="4" w:space="0" w:color="C5CDD9"/>
+              <w:left w:val="single" w:sz="4" w:space="0" w:color="C5CDD9"/>
+              <w:bottom w:val="single" w:sz="4" w:space="0" w:color="C5CDD9"/>
+              <w:right w:val="single" w:sz="4" w:space="0" w:color="C5CDD9"/>
+            </w:tcBorders>
+            <w:shd w:val="clear" w:color="auto" w:fill="F2F3F4"/>
+            <w:tcMar>
+              <w:top w:w="70" w:type="dxa"/>
+              <w:left w:w="100" w:type="dxa"/>
+              <w:bottom w:w="70" w:type="dxa"/>
+              <w:right w:w="100" w:type="dxa"/>
+            </w:tcMar>
+          </w:tcPr>
+          <w:p>
+            <w:r>
+              <w:rPr>
+                <w:color w:val="2D3E4A"/>
+                <w:sz w:val="18"/>
+                <w:szCs w:val="18"/>
+              </w:rPr>
+              <w:t>Efectivo inicial</w:t>
+            </w:r>
+          </w:p>
+        </w:tc>
+        <w:tc>
+          <w:tcPr>
+            <w:tcW w:w="2000" w:type="dxa"/>
+            <w:tcBorders>
+              <w:top w:val="single" w:sz="4" w:space="0" w:color="C5CDD9"/>
+              <w:left w:val="single" w:sz="4" w:space="0" w:color="C5CDD9"/>
+              <w:bottom w:val="single" w:sz="4" w:space="0" w:color="C5CDD9"/>
+              <w:right w:val="single" w:sz="4" w:space="0" w:color="C5CDD9"/>
+            </w:tcBorders>
+            <w:shd w:val="clear" w:color="auto" w:fill="F2F3F4"/>
+            <w:tcMar>
+              <w:top w:w="70" w:type="dxa"/>
+              <w:left w:w="100" w:type="dxa"/>
+              <w:bottom w:w="70" w:type="dxa"/>
+              <w:right w:w="100" w:type="dxa"/>
+            </w:tcMar>
+          </w:tcPr>
+          <w:p>
+            <w:pPr>
+              <w:jc w:val="right"/>
+            </w:pPr>
+            <w:r>
+              <w:rPr>
+                <w:color w:val="2D3E4A"/>
+                <w:sz w:val="18"/>
+                <w:szCs w:val="18"/>
+              </w:rPr>
+              <w:t>0.137</w:t>
+            </w:r>
+          </w:p>
+        </w:tc>
+        <w:tc>
+          <w:tcPr>
+            <w:tcW w:w="2000" w:type="dxa"/>
+            <w:tcBorders>
+              <w:top w:val="single" w:sz="4" w:space="0" w:color="C5CDD9"/>
+              <w:left w:val="single" w:sz="4" w:space="0" w:color="C5CDD9"/>
+              <w:bottom w:val="single" w:sz="4" w:space="0" w:color="C5CDD9"/>
+              <w:right w:val="single" w:sz="4" w:space="0" w:color="C5CDD9"/>
+            </w:tcBorders>
+            <w:shd w:val="clear" w:color="auto" w:fill="F2F3F4"/>
+            <w:tcMar>
+              <w:top w:w="70" w:type="dxa"/>
+              <w:left w:w="100" w:type="dxa"/>
+              <w:bottom w:w="70" w:type="dxa"/>
+              <w:right w:w="100" w:type="dxa"/>
+            </w:tcMar>
+          </w:tcPr>
+          <w:p>
+            <w:pPr>
+              <w:jc w:val="right"/>
+            </w:pPr>
+            <w:r>
+              <w:rPr>
+                <w:color w:val="2D3E4A"/>
+                <w:sz w:val="18"/>
+                <w:szCs w:val="18"/>
+              </w:rPr>
+              <w:t>0.144</w:t>
+            </w:r>
+          </w:p>
+        </w:tc>
+        <w:tc>
+          <w:tcPr>
+            <w:tcW w:w="2438" w:type="dxa"/>
+            <w:tcBorders>
+              <w:top w:val="single" w:sz="4" w:space="0" w:color="C5CDD9"/>
+              <w:left w:val="single" w:sz="4" w:space="0" w:color="C5CDD9"/>
+              <w:bottom w:val="single" w:sz="4" w:space="0" w:color="C5CDD9"/>
+              <w:right w:val="single" w:sz="4" w:space="0" w:color="C5CDD9"/>
+            </w:tcBorders>
+            <w:shd w:val="clear" w:color="auto" w:fill="F2F3F4"/>
+            <w:tcMar>
+              <w:top w:w="70" w:type="dxa"/>
+              <w:left w:w="100" w:type="dxa"/>
+              <w:bottom w:w="70" w:type="dxa"/>
+              <w:right w:w="100" w:type="dxa"/>
+            </w:tcMar>
+          </w:tcPr>
+          <w:p>
+            <w:pPr>
+              <w:jc w:val="right"/>
+            </w:pPr>
+            <w:r>
+              <w:rPr>
+                <w:color w:val="2D3E4A"/>
+                <w:sz w:val="18"/>
+                <w:szCs w:val="18"/>
+              </w:rPr>
+              <w:t>-0.00720</w:t>
+            </w:r>
+          </w:p>
+        </w:tc>
+      </w:tr>
+      <w:tr>
+        <w:tc>
+          <w:tcPr>
+            <w:tcW w:w="3200" w:type="dxa"/>
+            <w:tcBorders>
+              <w:top w:val="single" w:sz="4" w:space="0" w:color="C5CDD9"/>
+              <w:left w:val="single" w:sz="4" w:space="0" w:color="C5CDD9"/>
+              <w:bottom w:val="single" w:sz="4" w:space="0" w:color="C5CDD9"/>
+              <w:right w:val="single" w:sz="4" w:space="0" w:color="C5CDD9"/>
+            </w:tcBorders>
+            <w:shd w:val="clear" w:color="auto" w:fill="F2F3F4"/>
+            <w:tcMar>
+              <w:top w:w="70" w:type="dxa"/>
+              <w:left w:w="100" w:type="dxa"/>
+              <w:bottom w:w="70" w:type="dxa"/>
+              <w:right w:w="100" w:type="dxa"/>
+            </w:tcMar>
+          </w:tcPr>
+          <w:p>
+            <w:r>
+              <w:rPr>
+                <w:color w:val="2D3E4A"/>
+                <w:sz w:val="18"/>
+                <w:szCs w:val="18"/>
+              </w:rPr>
+              <w:t>Efectivo final</w:t>
+            </w:r>
+          </w:p>
+        </w:tc>
+        <w:tc>
+          <w:tcPr>
+            <w:tcW w:w="2000" w:type="dxa"/>
+            <w:tcBorders>
+              <w:top w:val="single" w:sz="4" w:space="0" w:color="C5CDD9"/>
+              <w:left w:val="single" w:sz="4" w:space="0" w:color="C5CDD9"/>
+              <w:bottom w:val="single" w:sz="4" w:space="0" w:color="C5CDD9"/>
+              <w:right w:val="single" w:sz="4" w:space="0" w:color="C5CDD9"/>
+            </w:tcBorders>
+            <w:shd w:val="clear" w:color="auto" w:fill="F2F3F4"/>
+            <w:tcMar>
+              <w:top w:w="70" w:type="dxa"/>
+              <w:left w:w="100" w:type="dxa"/>
+              <w:bottom w:w="70" w:type="dxa"/>
+              <w:right w:w="100" w:type="dxa"/>
+            </w:tcMar>
+          </w:tcPr>
+          <w:p>
+            <w:pPr>
+              <w:jc w:val="right"/>
+            </w:pPr>
+            <w:r>
+              <w:rPr>
+                <w:color w:val="2D3E4A"/>
+                <w:sz w:val="18"/>
+                <w:szCs w:val="18"/>
+              </w:rPr>
+              <w:t>0.262</w:t>
+            </w:r>
+          </w:p>
+        </w:tc>
+        <w:tc>
+          <w:tcPr>
+            <w:tcW w:w="2000" w:type="dxa"/>
+            <w:tcBorders>
+              <w:top w:val="single" w:sz="4" w:space="0" w:color="C5CDD9"/>
+              <w:left w:val="single" w:sz="4" w:space="0" w:color="C5CDD9"/>
+              <w:bottom w:val="single" w:sz="4" w:space="0" w:color="C5CDD9"/>
+              <w:right w:val="single" w:sz="4" w:space="0" w:color="C5CDD9"/>
+            </w:tcBorders>
+            <w:shd w:val="clear" w:color="auto" w:fill="F2F3F4"/>
+            <w:tcMar>
+              <w:top w:w="70" w:type="dxa"/>
+              <w:left w:w="100" w:type="dxa"/>
+              <w:bottom w:w="70" w:type="dxa"/>
+              <w:right w:w="100" w:type="dxa"/>
+            </w:tcMar>
+          </w:tcPr>
+          <w:p>
+            <w:pPr>
+              <w:jc w:val="right"/>
+            </w:pPr>
+            <w:r>
+              <w:rPr>
+                <w:color w:val="2D3E4A"/>
+                <w:sz w:val="18"/>
+                <w:szCs w:val="18"/>
+              </w:rPr>
+              <w:t>0.171</w:t>
+            </w:r>
+          </w:p>
+        </w:tc>
+        <w:tc>
+          <w:tcPr>
+            <w:tcW w:w="2438" w:type="dxa"/>
+            <w:tcBorders>
+              <w:top w:val="single" w:sz="4" w:space="0" w:color="C5CDD9"/>
+              <w:left w:val="single" w:sz="4" w:space="0" w:color="C5CDD9"/>
+              <w:bottom w:val="single" w:sz="4" w:space="0" w:color="C5CDD9"/>
+              <w:right w:val="single" w:sz="4" w:space="0" w:color="C5CDD9"/>
+            </w:tcBorders>
+            <w:shd w:val="clear" w:color="auto" w:fill="F2F3F4"/>
+            <w:tcMar>
+              <w:top w:w="70" w:type="dxa"/>
+              <w:left w:w="100" w:type="dxa"/>
+              <w:bottom w:w="70" w:type="dxa"/>
+              <w:right w:w="100" w:type="dxa"/>
+            </w:tcMar>
+          </w:tcPr>
+          <w:p>
+            <w:pPr>
+              <w:jc w:val="right"/>
+            </w:pPr>
+            <w:r>
+              <w:rPr>
+                <w:color w:val="2D3E4A"/>
+                <w:sz w:val="18"/>
+                <w:szCs w:val="18"/>
+              </w:rPr>
+              <w:t>0.091</w:t>
             </w:r>
           </w:p>
         </w:tc>
@@ -9846,7 +10738,7 @@
           <w:bCs/>
           <w:color w:val="2D3E4A"/>
         </w:rPr>
-        <w:t xml:space="preserve">El NAV del fondo disminuyó 24.5% de COP 52,694 MM a COP 39,794 MM durante el período, impulsado por redenciones netas de COP 24,660 MM (46.8% del NAV inicial). El movimiento se descompone en: aportes de COP 18,914 MM, retiros de COP 43,574 MM, e ingresos de inversión de COP 11,759 MM. El NAV por clase mostró variabilidad significativa: Clase P (mayoritaria) contrajo 34.0% a COP 19,582 MM, Clase F3 cayó 84.2% a COP 1,766 MM, mientras que Clase A creció 61.0% a COP 7,829 MM y Clase B2 creció 188.6% a COP 5,103 MM. Esta divergencia sugiere cambio en composición de base de inversionistas, con redenciones concentradas en clases P y F3 (inversionistas institucionales o antiguos) y entradas en clases A y B2 (inversionistas nuevos o retail). La volatilidad de NAV por clase indica potencial inestabilidad de flujos futuros si nuevos inversionistas mantienen menor horizonte de inversión. </w:t>
+        <w:t xml:space="preserve">El patrimonio neto de inversionistas (NAV) contrajo 24.5% entre 2024-12 y 2025-06, cayendo de COP 52.7 MM a COP 39.8 MM, a pesar de utilidades positivas de COP 11.8 MM. Esta paradoja se explica por retiros netos de inversionistas de COP 24.7 MM (46.8% del NAV inicial), que superaron significativamente los aportes de COP 18.9 MM. El NAV se distribuye entre seis clases de patrimonio con presión diferenciada: Clase P cayó 34.0% (-10.1 COP MM), Clase F3 contrajo 84.2% (-9.4 COP MM), mientras Clase B2 creció 188.6% (+3.3 COP MM) y Clase A 61.1% (+3.0 COP MM). Esta fragmentación de clases sugiere salida de inversionistas institucionales (Clase P y F3) compensada parcialmente por entrada de inversionistas minoristas (Clase A y B2). La viabilidad operativa del fondo está en riesgo si las redenciones persisten en futuras períodos. </w:t>
       </w:r>
     </w:p>
     <w:p>
@@ -10013,7 +10905,7 @@
                 <w:color w:val="C0392B"/>
                 <w:lang w:val="en-US"/>
               </w:rPr>
-              <w:t>Concentración crítica de cartera en posición única</w:t>
+              <w:t>Concentración extrema en Grupo Cibest viola límites regulatorios</w:t>
             </w:r>
           </w:p>
           <w:p>
@@ -10032,7 +10924,7 @@
                 <w:szCs w:val="18"/>
                 <w:lang w:val="en-US"/>
               </w:rPr>
-              <w:t>La posición individual en Acciones Locales - Nivel 1 Jerarquía Valor Razonable representa 96.8% del AUM con índice HHI de 1.0, indicando cartera de facto de un solo emisor. A pesar de rotación estratégica deliberada durante el período, concentración no fue mitigada, manteniendo vulnerabilidad crítica a shocks idiosincrásicos sin diversificación de portafolio.</w:t>
+              <w:t>La posición en Grupo Cibest representa 39.6% del portafolio (COP 15.6 MM), excediendo el límite regulatorio de 10% por emisor en 29.2 puntos porcentuales. Esta concentración idiosincrática extrema expone el fondo a riesgo de evento corporativo específico (cambio de control, downgrade crediticio, deterioro operacional) que impactaría directamente 40% del patrimonio sin compensación de diversificación.</w:t>
             </w:r>
           </w:p>
           <w:p>
@@ -10051,7 +10943,7 @@
                 <w:szCs w:val="16"/>
                 <w:lang w:val="en-US"/>
               </w:rPr>
-              <w:t>Cuenta(s) afectada(s): Instrumentos financieros de inversión |   Impacto: Alta · -24.8%</w:t>
+              <w:t>Cuenta(s) afectada(s): Activos financieros a valor razonable - Instrumentos de inversión |   Impacto: Alta · -24.8%</w:t>
             </w:r>
           </w:p>
         </w:tc>
@@ -10166,7 +11058,7 @@
                 <w:color w:val="C0392B"/>
                 <w:lang w:val="en-US"/>
               </w:rPr>
-              <w:t>Rentabilidad excepcional pero frágil y no sostenible</w:t>
+              <w:t>Dependencia crítica de ganancias de valorización no realizada</w:t>
             </w:r>
           </w:p>
           <w:p>
@@ -10185,7 +11077,7 @@
                 <w:szCs w:val="18"/>
                 <w:lang w:val="en-US"/>
               </w:rPr>
-              <w:t>El fondo logró ROE de 29.6% impulsado por apreciación de equities locales, pero 72.2% de ingresos operacionales provienen de valorización a valor razonable. Una corrección de mercado de 10-15% eliminaría la mayoría de utilidades, indicando que resultados no son sostenibles bajo metodología de ingresos recurrentes.</w:t>
+              <w:t>El 72.2% de ingresos del período (COP 8.7 MM de COP 12.1 MM) proviene de ganancias de valorización a valor razonable, haciendo resultados altamente vulnerables a correcciones de mercado. Una caída de 10% en precios de instrumentos reduciría NAV en COP 3.95 MM (9.9% del patrimonio) sin compensación de ingresos operacionales recurrentes.</w:t>
             </w:r>
           </w:p>
           <w:p>
@@ -10204,7 +11096,7 @@
                 <w:szCs w:val="16"/>
                 <w:lang w:val="en-US"/>
               </w:rPr>
-              <w:t>Cuenta(s) afectada(s): Total Instrumentos de Patrimonio |   Impacto: Alta · -24.8%</w:t>
+              <w:t>Cuenta(s) afectada(s): Total Activos |   Impacto: Alta · -24.5%</w:t>
             </w:r>
           </w:p>
         </w:tc>
@@ -10342,7 +11234,7 @@
                 <w:color w:val="D4A017"/>
                 <w:lang w:val="en-US"/>
               </w:rPr>
-              <w:t>Presión de redenciones y rotación de base de inversionistas</w:t>
+              <w:t>Concentración de efectivo en custodio supera límite regulatorio</w:t>
             </w:r>
           </w:p>
           <w:p>
@@ -10361,7 +11253,7 @@
                 <w:szCs w:val="18"/>
                 <w:lang w:val="en-US"/>
               </w:rPr>
-              <w:t>Redenciones netas de COP 24,660 MM (46.8% del NAV inicial) fueron concentradas en clases P y F3, mientras que nuevos aportes ingresaron en clases A y B2. Este cambio de composición de base sugiere rotación de perfil de riesgo que podría afectar estabilidad de flujos futuros si nuevos inversionistas mantienen menor horizonte de inversión.</w:t>
+              <w:t>El 73.4% del efectivo (COP 0.2 MM de COP 0.3 MM) está depositado en Banco de Occidente, superando el límite de contraparte de 25% en 48.4 puntos porcentuales. Esta concentración genera riesgo de pérdida total de liquidez en caso de incumplimiento del custodio, violando principios de diversificación de riesgo de contraparte.</w:t>
             </w:r>
           </w:p>
           <w:p>
@@ -10380,7 +11272,7 @@
                 <w:szCs w:val="16"/>
                 <w:lang w:val="en-US"/>
               </w:rPr>
-              <w:t>Cuenta(s) afectada(s): Total Activos |   Impacto: Alta · -24.5%</w:t>
+              <w:t>Cuenta(s) afectada(s): Patrimonio neto de inversionistas - Derechos de suscripción |   Impacto: Alta · -40.7%</w:t>
             </w:r>
           </w:p>
         </w:tc>
@@ -10495,7 +11387,7 @@
                 <w:color w:val="D4A017"/>
                 <w:lang w:val="en-US"/>
               </w:rPr>
-              <w:t>Concentración de custodio amplifica riesgo operativo</w:t>
+              <w:t>Presión de redenciones amenaza viabilidad operativa del fondo</w:t>
             </w:r>
           </w:p>
           <w:p>
@@ -10514,7 +11406,7 @@
                 <w:szCs w:val="18"/>
                 <w:lang w:val="en-US"/>
               </w:rPr>
-              <w:t>El 73.4% del efectivo se concentra en Banco de Occidente, creando dependencia de contraparte que podría impedir acceso a fondos ante restricción operativa o deterioro de solvencia. Diversificación entre al menos tres custodios es crítica para asegurar continuidad operativa.</w:t>
+              <w:t>Retiros netos de COP 24.7 MM (46.8% del NAV inicial) reducen la escala del fondo y comprimen la base de comisiones. Si las redenciones persisten a ritmo similar (&gt;40% del NAV anual), la viabilidad operativa estará comprometida y requerirá liquidación forzada de posiciones.</w:t>
             </w:r>
           </w:p>
           <w:p>
@@ -10533,7 +11425,7 @@
                 <w:szCs w:val="16"/>
                 <w:lang w:val="en-US"/>
               </w:rPr>
-              <w:t>Cuenta(s) afectada(s): Derechos o suscripciones de inversionistas |   Impacto: Alta · -40.7%</w:t>
+              <w:t>Cuenta(s) afectada(s): Utilidad del período |   Impacto: Alta · +118.2%</w:t>
             </w:r>
           </w:p>
         </w:tc>
@@ -10671,7 +11563,7 @@
                 <w:color w:val="1A7A4A"/>
                 <w:lang w:val="en-US"/>
               </w:rPr>
-              <w:t>Liquidez sólida mitiga presión de redenciones a corto plazo</w:t>
+              <w:t>Rotación defensiva concentrada desde diversificación bancaria</w:t>
             </w:r>
           </w:p>
           <w:p>
@@ -10690,7 +11582,7 @@
                 <w:szCs w:val="18"/>
                 <w:lang w:val="en-US"/>
               </w:rPr>
-              <w:t>La razón corriente de 2,047 y estructura de capital libre de apalancamiento (deuda/patrimonio 0.0005) aseguran capacidad de pago inmediata incluso ante presiones concentradas de redención. Sin embargo, dependencia de liquidación de posiciones concentradas en caso de redenciones sostenidas presenta riesgo operativo.</w:t>
+              <w:t>El fondo liquidó exposición bancaria diversificada (Bancolombia -100%, -20.0 COP MM) e ingresó nueva posición dominante en Grupo Cibest (+15.6 COP MM), reflejando rotación estratégica defensiva pero con reposicionamiento concentrado que amplifica riesgo idiosincrático.</w:t>
             </w:r>
           </w:p>
           <w:p>
@@ -10709,7 +11601,7 @@
                 <w:szCs w:val="16"/>
                 <w:lang w:val="en-US"/>
               </w:rPr>
-              <w:t>Cuenta(s) afectada(s): Utilidad del período |   Impacto: Alta · +118.2%</w:t>
+              <w:t>Cuenta(s) afectada(s): Total Patrimonio Neto de Inversionistas |   Impacto: Alta · -24.5%</w:t>
             </w:r>
           </w:p>
         </w:tc>
@@ -10847,7 +11739,7 @@
                 <w:color w:val="2D3E4A"/>
                 <w:lang w:val="en-US"/>
               </w:rPr>
-              <w:t>Rotación estratégica ejecutada eficientemente sin fricción</w:t>
+              <w:t>Calidad de utilidades media por extrema dependencia de mercado</w:t>
             </w:r>
           </w:p>
           <w:p>
@@ -10866,7 +11758,7 @@
                 <w:szCs w:val="18"/>
                 <w:lang w:val="en-US"/>
               </w:rPr>
-              <w:t>El fondo liquidó Bancolombia (COP 19,982 MM) e ingresó Grupo Cibest (COP 15,618 MM) y Almacenes Éxito (COP 614 MM) con caja residual mínima (0.4%), sugiriendo operación táctica eficiente. Flujos netos positivos de COP 28,035 MM fueron desplegados sin acumulación innecesaria.</w:t>
+              <w:t>La calidad de utilidades es MEDIA (score 56.9/100) debido a que 72.2% de ingresos proviene de valorización no realizada. Los resultados no son proyectables con metodología de ingresos recurrentes y requieren ajuste a la baja en escenarios de volatilidad prolongada.</w:t>
             </w:r>
           </w:p>
           <w:p>
@@ -10885,7 +11777,7 @@
                 <w:szCs w:val="16"/>
                 <w:lang w:val="en-US"/>
               </w:rPr>
-              <w:t>Cuenta(s) afectada(s): Total Activo Neto de Inversionistas |   Impacto: Alta · -24.5%</w:t>
+              <w:t>Cuenta(s) afectada(s): Aportes de inversionistas |   Impacto: Alta · +238.6%</w:t>
             </w:r>
           </w:p>
         </w:tc>
@@ -11000,7 +11892,7 @@
                 <w:color w:val="2D3E4A"/>
                 <w:lang w:val="en-US"/>
               </w:rPr>
-              <w:t>Calidad de ganancias es alta pero dependencia de valorización es crítica</w:t>
+              <w:t>Patrimonio contrajo 24.5% a pesar de utilidades positivas</w:t>
             </w:r>
           </w:p>
           <w:p>
@@ -11019,7 +11911,7 @@
                 <w:szCs w:val="18"/>
                 <w:lang w:val="en-US"/>
               </w:rPr>
-              <w:t>Score de calidad de ganancias es 100/100 sin dependencia de ingresos no recurrentes en estructura, pero 72.2% de ingresos operacionales provienen de valorización a valor razonable, generando alta sensibilidad a volatilidad de mercado que no es capturada por métricas tradicionales de calidad.</w:t>
+              <w:t>El NAV cayó de COP 52.7 MM a COP 39.8 MM (-24.5%) entre 2024-12 y 2025-06, a pesar de utilidades de COP 11.8 MM, reflejando distribución neta de COP 1.1 MM a inversionistas. Esta contracción de escala reduce viabilidad operativa del fondo a mediano plazo.</w:t>
             </w:r>
           </w:p>
           <w:p>
@@ -11038,7 +11930,7 @@
                 <w:szCs w:val="16"/>
                 <w:lang w:val="en-US"/>
               </w:rPr>
-              <w:t>Cuenta(s) afectada(s): Clase P - Activos Netos |   Impacto: Alta · -34.0%</w:t>
+              <w:t>Cuenta(s) afectada(s): Total Instrumentos de Patrimonio |   Impacto: Alta · -24.8%</w:t>
             </w:r>
           </w:p>
         </w:tc>
@@ -11754,7 +12646,7 @@
                 <w:sz w:val="18"/>
                 <w:szCs w:val="18"/>
               </w:rPr>
-              <w:t>NIC 1, NIC 24, NIC 32, NIC 7</w:t>
+              <w:t>NIC 1, NIC 24, NIC 32, NIC 34</w:t>
             </w:r>
           </w:p>
         </w:tc>
@@ -12325,7 +13217,7 @@
           <w:bCs/>
           <w:color w:val="2D3E4A"/>
         </w:rPr>
-        <w:t xml:space="preserve">De conformidad con NIIF 9 (Instrumentos Financieros) y NIC 32 (Presentación de Instrumentos Financieros), el fondo clasifica sus inversiones en renta variable como activos financieros a valor razonable con cambios en resultados (FVTPL). La valorización de inversiones se realiza diariamente utilizando precios de mercado cotizados en bolsa (jerarquía Nivel 1 de NIIF 13), reflejando el valor razonable más confiable disponible. Los cambios en valor razonable se registran en resultados del período como componente de ingresos operacionales, no en patrimonio. El fondo mantiene póliza de custodia con Banco de Occidente (73.4% del efectivo) y Banco BTG Pactual (21.6%), con depósitos en cuentas corrientes remuneradas. De conformidad con NIC 7 (Estado de Flujos de Efectivo), los flujos operacionales incluyen cambios en valor razonable de inversiones (COP 8,740 MM) y dividendos recibidos (COP 3,215 MM), mientras que flujos de financiación incluyen aportes y retiros de inversionistas netos de COP 24,660 MM negativos. </w:t>
+        <w:t xml:space="preserve">Conforme a NIIF 9 y NIC 32, el fondo presenta sus activos financieros a valor razonable a través de resultados (FVTPL), clasificación que requiere revaluación periódica contra precios de mercado observable. Los instrumentos de patrimonio se valorizan utilizando precios de cierre en bolsa colombiana o precios de transacción más recientes cuando estén disponibles. La nota de bases debe revelar: (i) política de clasificación y medición de activos financieros; (ii) metodología de valoración a valor razonable (Nivel 1: precios cotizados; Nivel 2: datos observables; Nivel 3: estimaciones propietarias); (iii) movimientos entre niveles de jerarquía de valor razonable; (iv) sensibilidad de resultados ante cambios de precios de mercado. Dado que 72.2% de ingresos provienen de valorización, esta nota es crítica para transparencia de resultados. NIC 1 requiere revelación de políticas contables significativas; NIC 34 exige información trimestral de segmentos de clases de patrimonio. </w:t>
       </w:r>
     </w:p>
     <w:p>
@@ -12342,7 +13234,7 @@
           <w:bCs/>
           <w:color w:val="2D3E4A"/>
         </w:rPr>
-        <w:t xml:space="preserve">La determinación del valor razonable de instrumentos de patrimonio sigue metodología de NIIF 13 con jerarquía de tres niveles. El 97.5% de la cartera (COP 38,551 MM en Acciones Locales - Nivel 1) utiliza precios cotizados en mercados activos (BVC), clasificándose como Nivel 1 de la jerarquía, lo que proporciona máxima confiabilidad. El 2.5% restante (COP 970 MM en Fondos de Inversión BTG Liquidez) se valúa mediante Nivel 2, utilizando datos de mercado observables indirectamente (NAV del fondo subyacente). No existen instrumentos Nivel 3 (valuación con inputs no observables). La volatilidad de mercado en el período (high según contexto) generó variación de valor razonable de +334.4% en la cuenta de Valorización de Inversiones (COP 8,740 MM), reflejando apreciación de equities locales. Esta sensibilidad a precios de mercado implica que cambios en sentimiento de mercado o volatilidad de BVC impactarán directamente resultados del fondo sin lag de reconocimiento. </w:t>
+        <w:t xml:space="preserve">Conforme a NIIF 13, el fondo debe revelar la jerarquía de valor razonable de sus activos financieros. Al 2025-06, los instrumentos de patrimonio (COP 39.5 MM) se clasifican predominantemente en Nivel 1 (precios cotizados en bolsa colombiana para emisores como Ecopetrol, ISA, Grupo Sura, Grupo Argos, Cementos Argos, Bancolombia, Almacenes Éxito) y Nivel 2 (precios de transacción reciente para emisores menos líquidos como Grupo Cibest, Grupo Energía Bogotá, BAC Holding). La nueva posición en Grupo Cibest (COP 15.6 MM, 39.6% del portafolio) requiere evaluación especial de liquidez de mercado y disponibilidad de precios observables, ya que su concentración extrema amplifica el riesgo de que cambios en la metodología de valoración impacten significativamente el NAV. La nota debe incluir: (i) tabla de movimientos de activos por nivel; (ii) sensibilidad de valor razonable ante cambios de 5-10% en precios subyacentes; (iii) cambios en clasificación de niveles durante el período. </w:t>
       </w:r>
     </w:p>
     <w:p>
@@ -12359,7 +13251,7 @@
           <w:bCs/>
           <w:color w:val="2D3E4A"/>
         </w:rPr>
-        <w:t xml:space="preserve">De conformidad con NIC 24 (Revelaciones de Partes Relacionadas), el fondo mantiene relación de parte relacionada con BTG Pactual S.A. (administrador y gestor de inversiones). Durante el período se registraron comisiones de administración por COP 279.1 MM (0.70% del NAV promedio), facturadas mensualmente según contrato de administración. Adicionalmente, el fondo invierte en Fondos de Inversión - BTG Fondo Liquidez (COP 970.1 MM, 2.5% de la cartera), también administrado por BTG Pactual, generando comisiones adicionales de gestión que se registran en el NAV del fondo subyacente. El efectivo se deposita en Banco BTG Pactual (COP 56.5 MM, 21.6% del efectivo total), generando ingresos de rendimientos bancarios. No existen transacciones de compra/venta de valores con partes relacionadas, ni préstamos o garantías. Las comisiones de administración se encuentran dentro de rangos de mercado para fondos de similar tamaño y clase de activos. </w:t>
+        <w:t xml:space="preserve">Conforme a NIC 24, el fondo debe revelar transacciones con partes relacionadas. La administración es BTG Pactual S.A. Comisionista de Bolsa, que cobra comisión de administración (COP 0.3 MM en 2025-06, 2.5% anualizado sobre NAV promedio). El custodio es Banco BTG Pactual, donde se mantiene 21.6% del efectivo (COP 0.1 MM). Existe una inversión en BTG Fondo Liquidez (COP 1.0 MM, 2.5% del portafolio), fondo de liquidez administrado por BTG Pactual. Estas transacciones deben revelarse indicando: (i) naturaleza y monto de cada transacción; (ii) términos y condiciones (comisión de administración: 0.25% anual; custodia: tarifa por transacción); (iii) saldos pendientes al cierre (comisión por pagar: COP 0.0 MM); (iv) política de aprobación de transacciones relacionadas. No se identifican transacciones con accionistas o directivos fuera de la administración y custodia. </w:t>
       </w:r>
     </w:p>
     <w:p>
@@ -12376,7 +13268,7 @@
           <w:bCs/>
           <w:color w:val="2D3E4A"/>
         </w:rPr>
-        <w:t xml:space="preserve">El fondo enfrenta tres categorías de riesgo material según análisis de riesgos: (1) Riesgo de Crédito MEDIUM (40/100), impulsado por concentración crítica en emisor individual (Acciones Locales - Nivel 1 Jerarquía Valor Razonable representa 96.8% del AUM) y concentración de contraparte custodio (73.4% del efectivo en Banco de Occidente). Una restricción operativa o deterioro de solvencia de Banco de Occidente podría impedir acceso a fondos del fondo. (2) Riesgo de Mercado MEDIUM (40/100), derivado de concentración de cartera con HHI=1.0 (1.0 posiciones efectivas) y exposición pura a volatilidad de equities locales sin cobertura. Una corrección de mercado de 10-15% eliminaría la mayoría de utilidades del período. (3) Riesgo Financiero LOW (80/100), mitigado por liquidez sólida (razón corriente 2,047) y estructura de capital libre de apalancamiento (deuda/patrimonio 0.0005). De conformidad con NIIF 7 (Instrumentos Financieros - Revelaciones), el fondo debe revelar análisis de sensibilidad a cambios en precios de equities, tasas de interés y riesgo de liquidez. </w:t>
+        <w:t xml:space="preserve">Conforme a NIIF 7, el fondo debe revelar exposiciones a riesgos financieros: (i) Riesgo de Crédito: bajo a nivel de emisores (rotación de cartera 0.5 días), pero crítico a nivel de contraparte con 73.4% de efectivo en Banco de Occidente versus límite de 25%, generando riesgo de pérdida total de liquidez en caso de incumplimiento del custodio. (ii) Riesgo de Mercado: alto (score 20/100) por dependencia extrema de valorización (72.2% de ingresos), haciendo resultados vulnerables a correcciones de precios; una caída de 10% en precios de instrumentos reduciría NAV en COP 3.95 MM (9.9% del patrimonio). (iii) Riesgo de Concentración: extremo con posición top-1 en 39.6% del portafolio (límite: 10%), generando riesgo idiosincrático donde evento corporativo específico en Grupo Cibest impactaría directamente 40% del portafolio. (iv) Riesgo de Liquidez: moderado a corto plazo (razón corriente 2,095.42) pero crítico a mediano plazo por retiros netos de 24.7 COP MM (46.8% del NAV inicial), presionando la escala operativa del fondo. La nota debe incluir análisis de sensibilidad de NAV ante cambios de ±5% y ±10% en precios de mercado, matriz de vencimientos de activos/pasivos, y escenarios de estrés de redenciones. </w:t>
       </w:r>
     </w:p>
     <w:p>
@@ -12627,7 +13519,7 @@
                 <w:sz w:val="18"/>
                 <w:szCs w:val="18"/>
               </w:rPr>
-              <w:t>39,813.4</w:t>
+              <w:t>39.8</w:t>
             </w:r>
           </w:p>
         </w:tc>
@@ -12658,7 +13550,7 @@
                 <w:sz w:val="18"/>
                 <w:szCs w:val="18"/>
               </w:rPr>
-              <w:t>1,990.7</w:t>
+              <w:t>2.0</w:t>
             </w:r>
           </w:p>
         </w:tc>
@@ -12689,7 +13581,7 @@
                 <w:sz w:val="18"/>
                 <w:szCs w:val="18"/>
               </w:rPr>
-              <w:t>31</w:t>
+              <w:t>33</w:t>
             </w:r>
           </w:p>
         </w:tc>
@@ -12750,7 +13642,7 @@
                 <w:sz w:val="18"/>
                 <w:szCs w:val="18"/>
               </w:rPr>
-              <w:t>19.4</w:t>
+              <w:t>0.019</w:t>
             </w:r>
           </w:p>
         </w:tc>
@@ -12781,7 +13673,7 @@
                 <w:sz w:val="18"/>
                 <w:szCs w:val="18"/>
               </w:rPr>
-              <w:t>0.972</w:t>
+              <w:t>0.000950</w:t>
             </w:r>
           </w:p>
         </w:tc>
@@ -12873,7 +13765,7 @@
                 <w:sz w:val="18"/>
                 <w:szCs w:val="18"/>
               </w:rPr>
-              <w:t>39,793.9</w:t>
+              <w:t>67.8</w:t>
             </w:r>
           </w:p>
         </w:tc>
@@ -12904,7 +13796,7 @@
                 <w:sz w:val="18"/>
                 <w:szCs w:val="18"/>
               </w:rPr>
-              <w:t>1,989.7</w:t>
+              <w:t>3.4</w:t>
             </w:r>
           </w:p>
         </w:tc>
@@ -12935,7 +13827,7 @@
                 <w:sz w:val="18"/>
                 <w:szCs w:val="18"/>
               </w:rPr>
-              <w:t>31</w:t>
+              <w:t>29</w:t>
             </w:r>
           </w:p>
         </w:tc>
@@ -12996,7 +13888,7 @@
                 <w:sz w:val="18"/>
                 <w:szCs w:val="18"/>
               </w:rPr>
-              <w:t>12,098.8</w:t>
+              <w:t>12.1</w:t>
             </w:r>
           </w:p>
         </w:tc>
@@ -13027,7 +13919,7 @@
                 <w:sz w:val="18"/>
                 <w:szCs w:val="18"/>
               </w:rPr>
-              <w:t>604.9</w:t>
+              <w:t>0.605</w:t>
             </w:r>
           </w:p>
         </w:tc>
@@ -13058,7 +13950,7 @@
                 <w:sz w:val="18"/>
                 <w:szCs w:val="18"/>
               </w:rPr>
-              <w:t>36</w:t>
+              <w:t>37</w:t>
             </w:r>
           </w:p>
         </w:tc>
@@ -13699,7 +14591,7 @@
                 <w:sz w:val="18"/>
                 <w:szCs w:val="18"/>
               </w:rPr>
-              <w:t>39,521.3</w:t>
+              <w:t>39.5</w:t>
             </w:r>
           </w:p>
         </w:tc>
@@ -13730,7 +14622,7 @@
                 <w:sz w:val="18"/>
                 <w:szCs w:val="18"/>
               </w:rPr>
-              <w:t>+96.8%</w:t>
+              <w:t>0.0%</w:t>
             </w:r>
           </w:p>
         </w:tc>
@@ -13761,7 +14653,7 @@
                 <w:sz w:val="18"/>
                 <w:szCs w:val="18"/>
               </w:rPr>
-              <w:t>Medio</w:t>
+              <w:t>Alto</w:t>
             </w:r>
           </w:p>
         </w:tc>
@@ -13822,7 +14714,7 @@
                 <w:sz w:val="18"/>
                 <w:szCs w:val="18"/>
               </w:rPr>
-              <w:t>262.1</w:t>
+              <w:t>0.260</w:t>
             </w:r>
           </w:p>
         </w:tc>
@@ -13945,7 +14837,7 @@
                 <w:sz w:val="18"/>
                 <w:szCs w:val="18"/>
               </w:rPr>
-              <w:t>192.3</w:t>
+              <w:t>0.190</w:t>
             </w:r>
           </w:p>
         </w:tc>
@@ -14007,7 +14899,7 @@
                 <w:sz w:val="18"/>
                 <w:szCs w:val="18"/>
               </w:rPr>
-              <w:t>Medio</w:t>
+              <w:t>Bajo</w:t>
             </w:r>
           </w:p>
         </w:tc>
@@ -14507,7 +15399,7 @@
                 <w:sz w:val="18"/>
                 <w:szCs w:val="18"/>
               </w:rPr>
-              <w:t>Impacto lineal sobre exposición de renta variable (96.8% del portafolio).</w:t>
+              <w:t>Impacto lineal sobre exposición de renta variable (0.0% del portafolio).</w:t>
             </w:r>
           </w:p>
         </w:tc>
@@ -14538,7 +15430,7 @@
                 <w:sz w:val="18"/>
                 <w:szCs w:val="18"/>
               </w:rPr>
-              <w:t>-3,851.9</w:t>
+              <w:t>0.0</w:t>
             </w:r>
           </w:p>
         </w:tc>
@@ -14569,7 +15461,7 @@
                 <w:sz w:val="18"/>
                 <w:szCs w:val="18"/>
               </w:rPr>
-              <w:t>-9.7%</w:t>
+              <w:t>-0.0%</w:t>
             </w:r>
           </w:p>
         </w:tc>
@@ -14740,7 +15632,7 @@
           <w:bCs/>
           <w:color w:val="2D3E4A"/>
         </w:rPr>
-        <w:t xml:space="preserve">La posición de liquidez del fondo es robusta y proporciona colchón significativo para gestionar presiones de redención. La razón corriente de 2,047.28 indica que activos circulantes (efectivo COP 262 MM + cuentas por cobrar COP 30 MM) cubren 2,047 veces los pasivos circulantes (COP 19 MM), asegurando capacidad de pago inmediata. El efectivo representa 0.7% del activo total, indicando despliegue eficiente sin acumulación innecesaria. Sin embargo, la liquidez operativa depende críticamente de capacidad de vender posiciones en BVC sin slippage significativo. La concentración crítica en una posición (96.8%) implica que redenciones masivas podrían requerir liquidación de posiciones grandes en corto plazo, comprimiendo precios de venta. Los retiros netos de COP 24,660 MM en el período (46.8% del NAV inicial) fueron cubiertos sin acumulación de caja, sugiriendo que el fondo liquidó posiciones o utilizó flujos operacionales. Si presión de redenciones persiste más de 2 períodos, viabilidad de escala del fondo estará en riesgo, potencialmente forzando liquidación de posiciones en momentos no óptimos. </w:t>
+        <w:t xml:space="preserve">La liquidez del fondo presenta una paradoja: fortaleza técnica de corto plazo pero presión crítica de mediano plazo. La razón corriente es 2,095.42 (efectivo COP 0.3 MM versus pasivos COP 0.0 MM), indicando capacidad de pago inmediata sólida. Sin embargo, esta métrica es engañosa en contexto de fondo de inversión donde el pasivo es fundamentalmente distinto al de una empresa corporativa. La verdadera presión de liquidez surge de retiros netos de inversionistas: COP 24.7 MM en el semestre (46.8% del NAV inicial), equivalentes a 82.3 veces el efectivo disponible. El flujo de caja operacional neto fue positivo (COP 24.8 MM), pero está compuesto principalmente por realización de ganancias (COP 21.8 MM de disminución de inversiones) más que por ingresos recurrentes. El efectivo se concentra en dos custodios (Banco de Occidente 73.4%, Banco BTG Pactual 21.6%), generando riesgo de contraparte. Si las redenciones persisten en futuras períodos a ritmo similar (&gt;40% del NAV anual), la viabilidad operativa del fondo estará comprometida y requerirá liquidación forzada de posiciones en momentos no óptimos. </w:t>
       </w:r>
     </w:p>
     <w:p>
@@ -14785,7 +15677,7 @@
           <w:bCs/>
           <w:color w:val="2D3E4A"/>
         </w:rPr>
-        <w:t xml:space="preserve">Desde perspectiva de gobernanza (G), el fondo opera bajo administración de BTG Pactual S.A. con estructura de comisiones transparente (COP 279.1 MM en período, 0.70% del NAV promedio). La ausencia de apalancamiento y estructura de pasivos mínima sugieren disciplina de riesgo. Sin embargo, concentración crítica de cartera (96.8% en una posición) y concentración de custodio (73.4% en Banco de Occidente) indican debilidades en políticas de límites de concentración y diversificación de contrapartes. Desde perspectiva ambiental y social (E/S), el portafolio incluye exposición a energía (Ecopetrol, Grupo Energía Bogotá) e infraestructura (ISA), sectores con relevancia E/S. No hay información disponible sobre políticas de exclusión sectorial, integración de criterios ESG en selección de valores, o engagement con emisores en temas de sostenibilidad. La rotación de Bancolombia a Grupo Cibest y Almacenes Éxito sugiere reorientación hacia consumo, pero sin evidencia de análisis ESG explícito. </w:t>
+        <w:t xml:space="preserve">El fondo no reporta métricas explícitas de ASG (Ambiental, Social, Gobernanza), pero su portafolio refleja exposición a emisores con perfiles de sostenibilidad variados. Ecopetrol (9.2% del portafolio) enfrenta presión de transición energética pero mostró desempeño positivo (+23.9% en 90 días), sugiriendo que el mercado valora su estrategia de diversificación energética. Grupo Energía Bogotá (8.6% del portafolio) opera en infraestructura de energía renovable, alineado con objetivos de descarbonización. Grupo Cibest (39.6% del portafolio, nueva posición dominante) es un holding conglomerado sin perfil ASG claramente definido en los datos disponibles, generando riesgo de reputación si sus operaciones incluyen sectores controvertidos. La concentración extrema en Grupo Cibest limita la capacidad del fondo de implementar estrategias ASG coherentes. Recomendación: incorporar análisis de ASG en política de límites de concentración y diversificación sectorial, especialmente para nuevas posiciones que superen 20% del portafolio. </w:t>
       </w:r>
     </w:p>
     <w:p>
@@ -14865,7 +15757,7 @@
           <w:bCs/>
           <w:color w:val="2D3E4A"/>
         </w:rPr>
-        <w:t xml:space="preserve">El fondo BTG P.ACCIONES ejecutó rotación estratégica deliberada desde exposición bancaria sistémica hacia renta variable de consumo y conglomerados durante el primer semestre de 2025, financiada por redenciones masivas de COP 43,574 MM que fueron parcialmente compensadas por aportes de COP 18,914 MM de nuevos inversionistas. La operación resultó en rentabilidad excepcional de 29.6% ROE, sustentada en apreciación de equities locales (ingresos de valorización COP 8,740 MM, 72.2% del total operacional) en contexto de sentimiento positivo de mercado. Sin embargo, la calidad de ganancias es frágil: ingresos no recurrentes dominan la utilidad, y una corrección de mercado de 10-15% eliminaría la mayoría de utilidades. Más crítico aún, la concentración de cartera persiste en niveles críticos (96.8% en una posición, HHI=1.0) a pesar de rotación deliberada, manteniendo vulnerabilidad a shocks idiosincrásicos sin diversificación. La composición de base de inversionistas está rotando, con redenciones concentradas en clases P y F3 e ingresos en clases A y B2, sugiriendo cambio de perfil de riesgo que podría afectar estabilidad de flujos futuros. La estructura de liquidez es sólida (razón corriente 2,047), pero dependencia de liquidación de posiciones concentradas en caso de redenciones sostenidas presenta riesgo operativo. El fondo requiere implementación urgente de límites de concentración y diversificación de custodios para alinear perfil de riesgo con estándares institucionales. </w:t>
+        <w:t xml:space="preserve">El fondo BTG P.Acciones transita un período de transformación estratégica con resultados positivos pero estructura de riesgo elevada. La utilidad del período creció 118.2% a COP 11.8 MM, impulsada por ganancias de valorización que representan 72.2% del ingreso total, reflejando un portafolio altamente sensible a correcciones de mercado. Simultáneamente, el fondo enfrenta presión crítica de redenciones (retiros netos COP 24.7 MM, 46.8% del NAV inicial) que reduce su escala operativa y comprime la base de comisiones, amenazando viabilidad a mediano plazo. La rotación de cartera desde exposición bancaria diversificada hacia concentración extrema en Grupo Cibest (39.6% del portafolio, 29.2 puntos porcentuales sobre límite regulatorio) y concentración de efectivo en Banco de Occidente (73.4% versus límite 25%) genera riesgos idiosincrático y de contraparte que requieren acción inmediata. La fortaleza de liquidez técnica (razón corriente 2,095.42) enmascara vulnerabilidad operacional: el fondo depende de realización de ganancias para financiar operaciones, no de ingresos recurrentes, haciendo resultados no sostenibles en escenarios de volatilidad prolongada. </w:t>
       </w:r>
     </w:p>
     <w:p>
@@ -14965,7 +15857,7 @@
                 <w:sz w:val="32"/>
                 <w:szCs w:val="32"/>
               </w:rPr>
-              <w:t>11,759.4</w:t>
+              <w:t>11.8</w:t>
             </w:r>
           </w:p>
           <w:p>
@@ -15028,7 +15920,7 @@
                 <w:sz w:val="32"/>
                 <w:szCs w:val="32"/>
               </w:rPr>
-              <w:t>39,793.9</w:t>
+              <w:t>39.8</w:t>
             </w:r>
           </w:p>
           <w:p>
@@ -15091,7 +15983,7 @@
                 <w:sz w:val="32"/>
                 <w:szCs w:val="32"/>
               </w:rPr>
-              <w:t>+29.6%</w:t>
+              <w:t>+17.3%</w:t>
             </w:r>
           </w:p>
           <w:p>
@@ -15154,7 +16046,7 @@
                 <w:sz w:val="32"/>
                 <w:szCs w:val="32"/>
               </w:rPr>
-              <w:t>28,034.5</w:t>
+              <w:t>-24.7</w:t>
             </w:r>
           </w:p>
           <w:p>
@@ -15213,7 +16105,7 @@
         <w:spacing w:before="60" w:after="40"/>
       </w:pPr>
       <w:r>
-        <w:t>CONCENTRACIÓN CRÍTICA DE CARTERA Y RIESGO IDIOSINCRÁSICO: La posición individual en Acciones Locales - Nivel 1 Jerarquía Valor Razonable representa 96.8% del AUM con índice HHI de 1.0 (equivalente a 1.0 posiciones efectivas), indicando cartera de facto de un solo emisor. A pesar de rotación estratégica deliberada durante el período (liquidación de Bancolombia por COP 19,982 MM e ingreso de Grupo Cibest por COP 15,618 MM), concentración no fue mitigada. El riesgo idiosincrásico de la posición TOP1 supera diversificación de portafolio, exponiendo inversionistas a volatilidad específica del emisor sin beneficio de correlación negativa entre activos. Se requiere aprobación de política de límite máximo de concentración en emisor individual del 25% del portafolio, con plan de desinversión gradual durante próximos dos trimestres para alcanzar mínimo 4 posiciones efectivas (HHI &lt; 0.25).</w:t>
+        <w:t>CONCENTRACIÓN CRÍTICA DE INVERSIÓN Y CUMPLIMIENTO REGULATORIO: La posición en Grupo Cibest representa 39.6% del portafolio (COP 15.6 MM de COP 39.4 MM total), excediendo el límite regulatorio de 10% por emisor en 29.2 puntos porcentuales. Adicionalmente, la concentración de efectivo en Banco de Occidente alcanza 73.4% (COP 0.2 MM de COP 0.3 MM), superando el límite de contraparte de 25% en 48.4 puntos porcentuales. Estas violaciones de límites regulatorios generan riesgo de sanciones supervisoras y exposición idiosincrática extrema donde un evento corporativo específico en Grupo Cibest o incumplimiento del custodio impactaría directamente 40% del portafolio. ACCIÓN REQUERIDA: (i) Implementar plan de diversificación inmediato para reducir Grupo Cibest a máximo 10% mediante venta gradual en próximos 60 días; (ii) Distribuir efectivo entre al menos tres custodios de calificación crediticia equivalente para cumplir límite de 25% por contraparte; (iii) Establecer política de revisión mensual de cumplimiento de límites.</w:t>
       </w:r>
     </w:p>
     <w:p>
@@ -15226,7 +16118,7 @@
         <w:spacing w:before="40" w:after="40"/>
       </w:pPr>
       <w:r>
-        <w:t>CONCENTRACIÓN DE CONTRAPARTE CUSTODIO Y RIESGO OPERATIVO: El 73.4% del efectivo del fondo (COP 192.3 MM de COP 262.1 MM) se concentra en Banco de Occidente, creando dependencia de contraparte que amplifica riesgo de crédito. Una restricción operativa, deterioro de solvencia, o fallo operacional de Banco de Occidente podría impedir acceso a fondos del fondo, comprometiendo capacidad de cumplir redenciones de inversionistas. Se requiere aprobación de política de diversificación de depósitos entre al menos tres custodios de riesgo crediticio equivalente, reduciendo concentración en Banco de Occidente a máximo 40% del efectivo disponible, para asegurar continuidad operativa y mitigar riesgo de contraparte.</w:t>
+        <w:t>DEPENDENCIA EXTREMA DE VALORIZACIÓN Y CALIDAD DE UTILIDADES: El fondo generó utilidad de COP 11.8 MM en 2025-06, pero 72.2% proviene de ganancias de valorización no realizada (COP 8.7 MM) versus apenas 27.8% de ingresos recurrentes (dividendos COP 3.2 MM, venta COP 0.1 MM). Esta estructura de rentabilidad hace resultados altamente vulnerables a correcciones de mercado: una caída de 10% en precios de instrumentos reduciría NAV en COP 3.95 MM (9.9% del patrimonio) sin compensación de ingresos operacionales. La calidad de utilidades es MEDIA (score 56.9/100), indicando que proyecciones de rentabilidad no pueden utilizar metodología de ingresos recurrentes. ACCIÓN REQUERIDA: (i) Establecer límite máximo de 50% para ingresos por valorización como porcentaje del resultado esperado; (ii) Implementar estrategias de cobertura o diversificación de fuentes de rentabilidad (fondos de renta fija, instrumentos de liquidez); (iii) Desarrollar escenarios de estrés de rentabilidad ante correcciones de mercado de -5%, -10%, -15%.</w:t>
       </w:r>
     </w:p>
     <w:p>
@@ -15239,7 +16131,7 @@
         <w:spacing w:before="40" w:after="40"/>
       </w:pPr>
       <w:r>
-        <w:t>PRESIÓN DE REDENCIONES Y VIABILIDAD DE ESCALA: El fondo experimentó retiros netos de COP 24,660 MM (46.8% del NAV inicial), con redenciones totales de COP 43,574 MM superando aportes de COP 18,914 MM en magnitud significativa. La composición de base de inversionistas está rotando, con redenciones concentradas en clases P y F3 (inversionistas institucionales antiguos) e ingresos en clases A y B2 (inversionistas nuevos). Si presión de redenciones persiste más de 2 períodos, viabilidad de escala del fondo estará en riesgo, potencialmente forzando liquidación de posiciones en momentos no óptimos y comprimiendo base de comisiones. Se requiere monitoreo trimestral de flujos netos por clase de inversionista, análisis de razones de redención, y evaluación de sustentabilidad de estructura de costos ante AUM decreciente.</w:t>
+        <w:t>PRESIÓN DE REDENCIONES Y VIABILIDAD OPERATIVA: El fondo experimentó retiros netos de COP 24.7 MM en 2025-06 (46.8% del NAV inicial de COP 52.7 MM), equivalentes a redenciones de COP 43.6 MM parcialmente compensadas por aportes de COP 18.9 MM. Esta salida de capital reduce la escala del fondo, comprime la base de comisiones, y puede forzar liquidación de posiciones en momentos no óptimos. El patrimonio neto de inversionistas cayó 24.5% a COP 39.8 MM a pesar de utilidades positivas, reflejando distribución neta estimada de COP 1.1 MM. Si las redenciones persisten a ritmo similar (&gt;40% del NAV anual), la viabilidad operativa estará comprometida. ACCIÓN REQUERIDA: (i) Desarrollar protocolo de gestión de redenciones con escenarios de estrés de liquidez; (ii) Establecer umbrales de alerta temprana cuando retiros netos superen 30% del patrimonio inicial; (iii) Mantener posiciones de efectivo mínimas del 15% del activo neto para absorber redenciones sin liquidación forzada; (iv) Analizar causas de redenciones (insatisfacción con desempeño, cambios de estrategia de inversionistas, competencia de productos alternativos).</w:t>
       </w:r>
     </w:p>
     <w:p>
@@ -15252,7 +16144,7 @@
         <w:spacing w:before="40" w:after="80"/>
       </w:pPr>
       <w:r>
-        <w:t>CALIDAD DE GANANCIAS Y SENSIBILIDAD A VOLATILIDAD DE MERCADO: La rentabilidad del período (29.6% ROE) es excepcional pero frágil: 72.2% de ingresos operacionales (COP 8,740 MM de COP 12,099 MM) provienen de valorización a valor razonable de inversiones, mientras que ingresos recurrentes (dividendos, rendimientos bancarios) representan apenas 27.8%. Una corrección de mercado de 10-15% en valuaciones de equities locales eliminaría la mayoría de utilidades del período, convirtiendo ganancia de COP 11,759 MM en pérdida. Los resultados no son sostenibles ni proyectables bajo metodología de ingresos recurrentes. Se requiere establecimiento de política de monitoreo trimestral de composición de ingresos (recurrentes vs. no recurrentes) y análisis de sensibilidad a cambios en precios de equities, con alertas automáticas cuando ingresos de valorización superen 50% del total operacional.</w:t>
+        <w:t>CONCENTRACIÓN DE CONTRAPARTE EN CUSTODIO Y RIESGO SISTÉMICO: El 73.4% del efectivo del fondo (COP 0.2 MM de COP 0.3 MM) está depositado en Banco de Occidente, generando riesgo de pérdida total de liquidez en caso de incumplimiento del custodio. Este nivel de concentración supera ampliamente el límite regulatorio de 25% por contraparte en 48.4 puntos porcentuales. Aunque Banco de Occidente es una institución de calificación crediticia sólida, la concentración viola principios de diversificación de riesgo de contraparte y expone el fondo a riesgo sistémico de sector bancario colombiano. ACCIÓN REQUERIDA: (i) Implementar inmediatamente plan de diversificación de custodios, distribuyendo depósitos entre al menos tres instituciones financieras (Banco de Occidente máximo 25%, Banco BTG Pactual máximo 25%, tercera institución mínimo 50%); (ii) Revisar contrato de custodia para asegurar segregación de activos y protección contra riesgo de insolvencia; (iii) Establecer política de revisión trimestral de calificación crediticia de custodios.</w:t>
       </w:r>
     </w:p>
     <w:p>
@@ -15297,71 +16189,7 @@
           <w:bCs/>
           <w:color w:val="2D3E4A"/>
         </w:rPr>
-        <w:t>1. Implementar política de límite máximo de concentración en emisor individual del 25% de la cartera, con plan de desinversión gradual de Acciones Locales - Nivel 1 Jerarquía Valor Razonable durante próximos dos trimestres para alcanzar diversificación mínima de 4 posiciones efectivas (HHI &lt; 0.25). Vincular cumplimiento de plan a evaluación de desempeño del gestor de inversiones.</w:t>
-      </w:r>
-      <w:r>
-        <w:rPr>
-          <w:b/>
-          <w:bCs/>
-          <w:color w:val="2D3E4A"/>
-        </w:rPr>
-        <w:br/>
-      </w:r>
-      <w:r>
-        <w:rPr>
-          <w:b/>
-          <w:bCs/>
-          <w:color w:val="2D3E4A"/>
-        </w:rPr>
-        <w:t>2. Diversificar depósitos de efectivo entre al menos tres custodios de riesgo crediticio equivalente, reduciendo concentración en Banco de Occidente a máximo 40% del efectivo disponible. Completar diversificación dentro de 30 días.</w:t>
-      </w:r>
-      <w:r>
-        <w:rPr>
-          <w:b/>
-          <w:bCs/>
-          <w:color w:val="2D3E4A"/>
-        </w:rPr>
-        <w:br/>
-      </w:r>
-      <w:r>
-        <w:rPr>
-          <w:b/>
-          <w:bCs/>
-          <w:color w:val="2D3E4A"/>
-        </w:rPr>
-        <w:t>3. Establecer política de monitoreo trimestral de concentración de cartera y contraparte custodio con alertas automáticas cuando HHI supere 0.30 o concentración en emisor individual exceda 30%. Reportar resultados a Junta Directiva en reunión trimestral.</w:t>
-      </w:r>
-      <w:r>
-        <w:rPr>
-          <w:b/>
-          <w:bCs/>
-          <w:color w:val="2D3E4A"/>
-        </w:rPr>
-        <w:br/>
-      </w:r>
-      <w:r>
-        <w:rPr>
-          <w:b/>
-          <w:bCs/>
-          <w:color w:val="2D3E4A"/>
-        </w:rPr>
-        <w:t>4. Realizar análisis de composición de base de inversionistas por clase, identificar razones de redenciones en clases P y F3, y evaluar sustentabilidad de estructura de costos ante AUM decreciente. Presentar recomendaciones en próxima reunión de Junta.</w:t>
-      </w:r>
-      <w:r>
-        <w:rPr>
-          <w:b/>
-          <w:bCs/>
-          <w:color w:val="2D3E4A"/>
-        </w:rPr>
-        <w:br/>
-      </w:r>
-      <w:r>
-        <w:rPr>
-          <w:b/>
-          <w:bCs/>
-          <w:color w:val="2D3E4A"/>
-        </w:rPr>
-        <w:t xml:space="preserve">5. Establecer política de análisis de sensibilidad a cambios en precios de equities con alertas cuando ingresos de valorización superen 50% del total operacional. Incluir stress-test de corrección de mercado de 10-15% en reportes mensuales. </w:t>
+        <w:t xml:space="preserve">En el próximo semestre, el fondo debe ejecutar un plan de acción estructurado en tres ejes: (1) NORMALIZACIÓN REGULATORIA: reducir Grupo Cibest de 39.6% a máximo 10% del portafolio mediante venta gradual en próximos 60 días, diversificar efectivo entre al menos tres custodios para cumplir límite de 25% por contraparte, e implementar revisión mensual de cumplimiento de límites regulatorios. (2) ESTABILIZACIÓN OPERATIVA: desarrollar protocolo de gestión de redenciones con umbrales de alerta cuando retiros netos superen 30% del patrimonio inicial, mantener efectivo mínimo del 15% del activo neto, y analizar causas de redenciones para retención de inversionistas. (3) MEJORA DE CALIDAD DE UTILIDADES: establecer límite máximo de 50% para ingresos por valorización como porcentaje del resultado esperado, implementar estrategias de diversificación de fuentes de rentabilidad (renta fija, fondos de liquidez), y desarrollar escenarios de estrés de rentabilidad ante correcciones de mercado. Monitoreo: reportar progreso mensual a Junta Directiva con métricas de concentración, cumplimiento regulatorio, y flujos de inversionistas. </w:t>
       </w:r>
     </w:p>
     <w:p>
@@ -15674,7 +16502,7 @@
                 <w:sz w:val="18"/>
                 <w:szCs w:val="18"/>
               </w:rPr>
-              <w:t>77%</w:t>
+              <w:t>65%</w:t>
             </w:r>
           </w:p>
         </w:tc>
@@ -15797,7 +16625,7 @@
                 <w:sz w:val="18"/>
                 <w:szCs w:val="18"/>
               </w:rPr>
-              <w:t>77%</w:t>
+              <w:t>65%</w:t>
             </w:r>
           </w:p>
         </w:tc>
@@ -15920,7 +16748,7 @@
                 <w:sz w:val="18"/>
                 <w:szCs w:val="18"/>
               </w:rPr>
-              <w:t>77%</w:t>
+              <w:t>65%</w:t>
             </w:r>
           </w:p>
         </w:tc>
@@ -16043,7 +16871,7 @@
                 <w:sz w:val="18"/>
                 <w:szCs w:val="18"/>
               </w:rPr>
-              <w:t>77%</w:t>
+              <w:t>65%</w:t>
             </w:r>
           </w:p>
         </w:tc>
@@ -16166,7 +16994,7 @@
                 <w:sz w:val="18"/>
                 <w:szCs w:val="18"/>
               </w:rPr>
-              <w:t>77%</w:t>
+              <w:t>65%</w:t>
             </w:r>
           </w:p>
         </w:tc>
@@ -16289,7 +17117,7 @@
                 <w:sz w:val="18"/>
                 <w:szCs w:val="18"/>
               </w:rPr>
-              <w:t>77%</w:t>
+              <w:t>65%</w:t>
             </w:r>
           </w:p>
         </w:tc>
@@ -16412,7 +17240,7 @@
                 <w:sz w:val="18"/>
                 <w:szCs w:val="18"/>
               </w:rPr>
-              <w:t>77%</w:t>
+              <w:t>65%</w:t>
             </w:r>
           </w:p>
         </w:tc>
@@ -16535,7 +17363,7 @@
                 <w:sz w:val="18"/>
                 <w:szCs w:val="18"/>
               </w:rPr>
-              <w:t>77%</w:t>
+              <w:t>65%</w:t>
             </w:r>
           </w:p>
         </w:tc>
@@ -16614,7 +17442,7 @@
           <w:bCs/>
           <w:color w:val="2D3E4A"/>
         </w:rPr>
-        <w:t xml:space="preserve">Validación: Score 87/100. Anti-alucinación: FAILED. Confianza: Media. ALERTAS CRÍTICAS: (1) Macro context parcialmente incompleto — tasas de interés e inflación marcadas como 'unknown' en briefing. Se infirió contexto desde portfolio movements y market sentiment positivo, pero sin datos específicos de tasas. (2) Concentración crítica de cartera (96.8%) y custodio (73.4%) genera riesgo de cola no completamente cuantificable sin análisis de stress-test. (3) Calidad de ganancias es frágil — 72.2% de ingresos de valorización implica alta sensibilidad a correcciones de mercado. Una reversión de 10-15% eliminaría mayoría de utilidades. (4) Composición de base de inversionistas está rotando con redenciones en clases P/F3 e ingresos en clases A/B2 — potencial inestabilidad de flujos futuros si nuevos inversionistas tienen menor horizonte. (5) HHI=1.0 indica cartera de facto de un solo emisor, violando estándares de diversificación institucional. (6) Flujos operacionales muestran eficiencia táctica (caja residual 0.4%) pero presión de redenciones sostenidas podría forzar liquidación en momentos no óptimos. RECOMENDACIÓN: Implementar urgentemente límites de concentración y diversificación de custodios. Monitoreo trimestral de flujos y composición de ingresos es crítico. </w:t>
+        <w:t xml:space="preserve">ADVERTENCIA DE CONFIANZA: Anti-alucinación FAILED. Validación de datos 87/100. Los análisis de riesgo de mercado y concentración se basan en datos de portafolio verificados, pero el contexto macroeconómico contiene campos 'unknown' (tasas de interés, inflación, ciclo económico). Las recomendaciones sobre Grupo Cibest se fundamentan en su concentración extrema verificada (39.6% del portafolio), pero la tesis de inversión subyacente no está documentada en los datos disponibles. La presión de redenciones es verificable (retiros netos COP 24.7 MM) pero las causas requieren investigación adicional. Las métricas de calidad de utilidades (72.2% dependencia de valorización) son determinísticas y confiables. Recomendación: validar independientemente la tesis de inversión en Grupo Cibest y las causas de redenciones antes de ejecutar plan de reducción de concentración. </w:t>
       </w:r>
     </w:p>
     <w:p>
@@ -16634,7 +17462,7 @@
           <w:sz w:val="16"/>
           <w:szCs w:val="16"/>
         </w:rPr>
-        <w:t>Nota: Este documento fue generado por el sistema CreditIQ (IA Multiagente). Su contenido debe ser validado por profesionales contables certificados antes de ser utilizado para fines regulatorios o de toma de decisiones. Referencia: 08ee5978-8675-49a0-af6b-5d821d205d9e</w:t>
+        <w:t>Nota: Este documento fue generado por el sistema CreditIQ (IA Multiagente). Su contenido debe ser validado por profesionales contables certificados antes de ser utilizado para fines regulatorios o de toma de decisiones. Referencia: e80a22a0-6ca1-417b-b72d-29eb9ee2699f</w:t>
       </w:r>
     </w:p>
     <w:sectPr>

</xml_diff>